<commit_message>
Update PRD Document from Meeting with changes
</commit_message>
<xml_diff>
--- a/Data/Variables and PPT/PRD IDEA Fellowship.docx
+++ b/Data/Variables and PPT/PRD IDEA Fellowship.docx
@@ -199,20 +199,9 @@
           <w:bCs/>
           <w:sz w:val="24"/>
           <w:szCs w:val="24"/>
-          <w:highlight w:val="yellow"/>
-          <w:lang w:val="en-US"/>
-        </w:rPr>
-        <w:t>Cover Photo:</w:t>
-      </w:r>
-      <w:r>
-        <w:rPr>
-          <w:b/>
-          <w:bCs/>
-          <w:sz w:val="24"/>
-          <w:szCs w:val="24"/>
-          <w:lang w:val="en-US"/>
-        </w:rPr>
-        <w:t xml:space="preserve"> </w:t>
+          <w:lang w:val="en-US"/>
+        </w:rPr>
+        <w:t xml:space="preserve">Cover Photo: </w:t>
       </w:r>
       <w:r>
         <w:rPr>
@@ -285,7 +274,6 @@
           <w:bCs/>
           <w:sz w:val="24"/>
           <w:szCs w:val="24"/>
-          <w:highlight w:val="yellow"/>
         </w:rPr>
         <w:t xml:space="preserve">Title: </w:t>
       </w:r>
@@ -293,7 +281,6 @@
         <w:rPr>
           <w:sz w:val="24"/>
           <w:szCs w:val="24"/>
-          <w:highlight w:val="yellow"/>
         </w:rPr>
         <w:t>Philadelphia Council District Health Dashboard</w:t>
       </w:r>
@@ -656,7 +643,6 @@
           <w:b/>
           <w:sz w:val="24"/>
           <w:szCs w:val="24"/>
-          <w:highlight w:val="yellow"/>
         </w:rPr>
       </w:pPr>
       <w:r>
@@ -664,7 +650,6 @@
           <w:bCs/>
           <w:sz w:val="24"/>
           <w:szCs w:val="24"/>
-          <w:highlight w:val="yellow"/>
         </w:rPr>
         <w:t>Rename “Owners” to “Homeowners”</w:t>
       </w:r>
@@ -681,14 +666,12 @@
           <w:b/>
           <w:sz w:val="24"/>
           <w:szCs w:val="24"/>
-          <w:highlight w:val="yellow"/>
-        </w:rPr>
-      </w:pPr>
-      <w:r>
-        <w:rPr>
-          <w:sz w:val="24"/>
-          <w:szCs w:val="24"/>
-          <w:highlight w:val="yellow"/>
+        </w:rPr>
+      </w:pPr>
+      <w:r>
+        <w:rPr>
+          <w:sz w:val="24"/>
+          <w:szCs w:val="24"/>
         </w:rPr>
         <w:t xml:space="preserve">Rename “Uninsured” to “Without Health Insurance” </w:t>
       </w:r>
@@ -697,7 +680,6 @@
           <w:rFonts w:ascii="Wingdings" w:eastAsia="Wingdings" w:hAnsi="Wingdings" w:cs="Wingdings"/>
           <w:sz w:val="24"/>
           <w:szCs w:val="24"/>
-          <w:highlight w:val="yellow"/>
         </w:rPr>
         <w:t>à</w:t>
       </w:r>
@@ -705,7 +687,6 @@
         <w:rPr>
           <w:sz w:val="24"/>
           <w:szCs w:val="24"/>
-          <w:highlight w:val="yellow"/>
         </w:rPr>
         <w:t xml:space="preserve"> subheading does not need to be capitalized</w:t>
       </w:r>
@@ -719,10 +700,10 @@
         </w:numPr>
         <w:spacing w:line="360" w:lineRule="auto"/>
         <w:rPr>
+          <w:b/>
           <w:sz w:val="24"/>
           <w:szCs w:val="24"/>
           <w:highlight w:val="yellow"/>
-          <w:lang w:val="en-US"/>
         </w:rPr>
       </w:pPr>
       <w:r>
@@ -730,18 +711,31 @@
           <w:sz w:val="24"/>
           <w:szCs w:val="24"/>
           <w:highlight w:val="yellow"/>
-          <w:lang w:val="en-US"/>
-        </w:rPr>
-        <w:t>Change Race/Ethnicity Variables as follows</w:t>
-      </w:r>
-      <w:r>
-        <w:rPr>
-          <w:sz w:val="24"/>
-          <w:szCs w:val="24"/>
-          <w:highlight w:val="yellow"/>
-          <w:lang w:val="en-US"/>
-        </w:rPr>
-        <w:t>:</w:t>
+        </w:rPr>
+        <w:t>Rename “Fatal Crashes” to “Fatal Car Crashes”</w:t>
+      </w:r>
+    </w:p>
+    <w:p>
+      <w:pPr>
+        <w:pStyle w:val="ListParagraph"/>
+        <w:numPr>
+          <w:ilvl w:val="1"/>
+          <w:numId w:val="3"/>
+        </w:numPr>
+        <w:spacing w:line="360" w:lineRule="auto"/>
+        <w:rPr>
+          <w:sz w:val="24"/>
+          <w:szCs w:val="24"/>
+          <w:lang w:val="en-US"/>
+        </w:rPr>
+      </w:pPr>
+      <w:r>
+        <w:rPr>
+          <w:sz w:val="24"/>
+          <w:szCs w:val="24"/>
+          <w:lang w:val="en-US"/>
+        </w:rPr>
+        <w:t>Change Race/Ethnicity Variables as follows:</w:t>
       </w:r>
     </w:p>
     <w:p>
@@ -755,15 +749,13 @@
         <w:rPr>
           <w:sz w:val="24"/>
           <w:szCs w:val="24"/>
-          <w:highlight w:val="yellow"/>
-          <w:lang w:val="en-US"/>
-        </w:rPr>
-      </w:pPr>
-      <w:r>
-        <w:rPr>
-          <w:sz w:val="24"/>
-          <w:szCs w:val="24"/>
-          <w:highlight w:val="yellow"/>
+          <w:lang w:val="en-US"/>
+        </w:rPr>
+      </w:pPr>
+      <w:r>
+        <w:rPr>
+          <w:sz w:val="24"/>
+          <w:szCs w:val="24"/>
           <w:lang w:val="en-US"/>
         </w:rPr>
         <w:t>Black --&gt; Race and Ethnicity: Black</w:t>
@@ -780,15 +772,13 @@
         <w:rPr>
           <w:sz w:val="24"/>
           <w:szCs w:val="24"/>
-          <w:highlight w:val="yellow"/>
-          <w:lang w:val="en-US"/>
-        </w:rPr>
-      </w:pPr>
-      <w:r>
-        <w:rPr>
-          <w:sz w:val="24"/>
-          <w:szCs w:val="24"/>
-          <w:highlight w:val="yellow"/>
+          <w:lang w:val="en-US"/>
+        </w:rPr>
+      </w:pPr>
+      <w:r>
+        <w:rPr>
+          <w:sz w:val="24"/>
+          <w:szCs w:val="24"/>
           <w:lang w:val="en-US"/>
         </w:rPr>
         <w:t xml:space="preserve">White --&gt; Race and </w:t>
@@ -797,7 +787,6 @@
         <w:rPr>
           <w:sz w:val="24"/>
           <w:szCs w:val="24"/>
-          <w:highlight w:val="yellow"/>
           <w:lang w:val="en-US"/>
         </w:rPr>
         <w:t>Ethnicity</w:t>
@@ -806,7 +795,6 @@
         <w:rPr>
           <w:sz w:val="24"/>
           <w:szCs w:val="24"/>
-          <w:highlight w:val="yellow"/>
           <w:lang w:val="en-US"/>
         </w:rPr>
         <w:t xml:space="preserve">: </w:t>
@@ -815,7 +803,6 @@
         <w:rPr>
           <w:sz w:val="24"/>
           <w:szCs w:val="24"/>
-          <w:highlight w:val="yellow"/>
           <w:lang w:val="en-US"/>
         </w:rPr>
         <w:t xml:space="preserve">non-Hispanic </w:t>
@@ -824,7 +811,6 @@
         <w:rPr>
           <w:sz w:val="24"/>
           <w:szCs w:val="24"/>
-          <w:highlight w:val="yellow"/>
           <w:lang w:val="en-US"/>
         </w:rPr>
         <w:t>White</w:t>
@@ -841,15 +827,13 @@
         <w:rPr>
           <w:sz w:val="24"/>
           <w:szCs w:val="24"/>
-          <w:highlight w:val="yellow"/>
-          <w:lang w:val="en-US"/>
-        </w:rPr>
-      </w:pPr>
-      <w:r>
-        <w:rPr>
-          <w:sz w:val="24"/>
-          <w:szCs w:val="24"/>
-          <w:highlight w:val="yellow"/>
+          <w:lang w:val="en-US"/>
+        </w:rPr>
+      </w:pPr>
+      <w:r>
+        <w:rPr>
+          <w:sz w:val="24"/>
+          <w:szCs w:val="24"/>
           <w:lang w:val="en-US"/>
         </w:rPr>
         <w:t>Native American --&gt; Race and Ethnicit</w:t>
@@ -858,7 +842,6 @@
         <w:rPr>
           <w:sz w:val="24"/>
           <w:szCs w:val="24"/>
-          <w:highlight w:val="yellow"/>
           <w:lang w:val="en-US"/>
         </w:rPr>
         <w:t xml:space="preserve">y: </w:t>
@@ -867,7 +850,6 @@
         <w:rPr>
           <w:sz w:val="24"/>
           <w:szCs w:val="24"/>
-          <w:highlight w:val="yellow"/>
           <w:lang w:val="en-US"/>
         </w:rPr>
         <w:t>Native American</w:t>
@@ -884,15 +866,13 @@
         <w:rPr>
           <w:sz w:val="24"/>
           <w:szCs w:val="24"/>
-          <w:highlight w:val="yellow"/>
-          <w:lang w:val="en-US"/>
-        </w:rPr>
-      </w:pPr>
-      <w:r>
-        <w:rPr>
-          <w:sz w:val="24"/>
-          <w:szCs w:val="24"/>
-          <w:highlight w:val="yellow"/>
+          <w:lang w:val="en-US"/>
+        </w:rPr>
+      </w:pPr>
+      <w:r>
+        <w:rPr>
+          <w:sz w:val="24"/>
+          <w:szCs w:val="24"/>
           <w:lang w:val="en-US"/>
         </w:rPr>
         <w:t xml:space="preserve">Asian --&gt; Race and Ethnicity: </w:t>
@@ -901,7 +881,6 @@
         <w:rPr>
           <w:sz w:val="24"/>
           <w:szCs w:val="24"/>
-          <w:highlight w:val="yellow"/>
           <w:lang w:val="en-US"/>
         </w:rPr>
         <w:t>Asian</w:t>
@@ -918,15 +897,13 @@
         <w:rPr>
           <w:sz w:val="24"/>
           <w:szCs w:val="24"/>
-          <w:highlight w:val="yellow"/>
-          <w:lang w:val="en-US"/>
-        </w:rPr>
-      </w:pPr>
-      <w:r>
-        <w:rPr>
-          <w:sz w:val="24"/>
-          <w:szCs w:val="24"/>
-          <w:highlight w:val="yellow"/>
+          <w:lang w:val="en-US"/>
+        </w:rPr>
+      </w:pPr>
+      <w:r>
+        <w:rPr>
+          <w:sz w:val="24"/>
+          <w:szCs w:val="24"/>
           <w:lang w:val="en-US"/>
         </w:rPr>
         <w:t>Pacific Islander --&gt; Race and Ethnicity: Pacific Islander</w:t>
@@ -943,15 +920,13 @@
         <w:rPr>
           <w:sz w:val="24"/>
           <w:szCs w:val="24"/>
-          <w:highlight w:val="yellow"/>
-          <w:lang w:val="en-US"/>
-        </w:rPr>
-      </w:pPr>
-      <w:r>
-        <w:rPr>
-          <w:sz w:val="24"/>
-          <w:szCs w:val="24"/>
-          <w:highlight w:val="yellow"/>
+          <w:lang w:val="en-US"/>
+        </w:rPr>
+      </w:pPr>
+      <w:r>
+        <w:rPr>
+          <w:sz w:val="24"/>
+          <w:szCs w:val="24"/>
           <w:lang w:val="en-US"/>
         </w:rPr>
         <w:t xml:space="preserve">Other Race --&gt; Race and Ethnicity: </w:t>
@@ -960,7 +935,6 @@
         <w:rPr>
           <w:sz w:val="24"/>
           <w:szCs w:val="24"/>
-          <w:highlight w:val="yellow"/>
           <w:lang w:val="en-US"/>
         </w:rPr>
         <w:t>Some other Race alone</w:t>
@@ -977,24 +951,22 @@
         <w:rPr>
           <w:sz w:val="24"/>
           <w:szCs w:val="24"/>
-          <w:highlight w:val="yellow"/>
-          <w:lang w:val="en-US"/>
-        </w:rPr>
-      </w:pPr>
-      <w:r>
-        <w:rPr>
-          <w:sz w:val="24"/>
-          <w:szCs w:val="24"/>
-          <w:highlight w:val="yellow"/>
-          <w:lang w:val="en-US"/>
-        </w:rPr>
+          <w:lang w:val="en-US"/>
+        </w:rPr>
+      </w:pPr>
+      <w:r>
+        <w:rPr>
+          <w:sz w:val="24"/>
+          <w:szCs w:val="24"/>
+          <w:lang w:val="en-US"/>
+        </w:rPr>
+        <w:lastRenderedPageBreak/>
         <w:t xml:space="preserve">Two or More Races --&gt; Race and Ethnicity: </w:t>
       </w:r>
       <w:r>
         <w:rPr>
           <w:sz w:val="24"/>
           <w:szCs w:val="24"/>
-          <w:highlight w:val="yellow"/>
           <w:lang w:val="en-US"/>
         </w:rPr>
         <w:t>Two or More Races</w:t>
@@ -1011,20 +983,69 @@
         <w:rPr>
           <w:sz w:val="24"/>
           <w:szCs w:val="24"/>
+          <w:lang w:val="en-US"/>
+        </w:rPr>
+      </w:pPr>
+      <w:r>
+        <w:rPr>
+          <w:sz w:val="24"/>
+          <w:szCs w:val="24"/>
+          <w:lang w:val="en-US"/>
+        </w:rPr>
+        <w:t>Hispanic</w:t>
+      </w:r>
+      <w:r>
+        <w:rPr>
+          <w:sz w:val="24"/>
+          <w:szCs w:val="24"/>
+          <w:lang w:val="en-US"/>
+        </w:rPr>
+        <w:t xml:space="preserve"> --&gt; Race and Ethnicity: Hispanic Only</w:t>
+      </w:r>
+    </w:p>
+    <w:p>
+      <w:pPr>
+        <w:spacing w:line="360" w:lineRule="auto"/>
+        <w:ind w:left="1440"/>
+        <w:rPr>
+          <w:sz w:val="24"/>
+          <w:szCs w:val="24"/>
+          <w:lang w:val="en-US"/>
+        </w:rPr>
+      </w:pPr>
+      <w:r>
+        <w:rPr>
+          <w:sz w:val="24"/>
+          <w:szCs w:val="24"/>
           <w:highlight w:val="yellow"/>
           <w:lang w:val="en-US"/>
         </w:rPr>
-      </w:pPr>
-      <w:r>
+        <w:t>***Subheadings need to be updated: Data Documentation Excel has been updated for correct headings and should match the ones</w:t>
+      </w:r>
+      <w:r>
+        <w:rPr>
+          <w:sz w:val="24"/>
+          <w:szCs w:val="24"/>
+          <w:lang w:val="en-US"/>
+        </w:rPr>
+        <w:t xml:space="preserve"> above. </w:t>
+      </w:r>
+    </w:p>
+    <w:p>
+      <w:pPr>
+        <w:pStyle w:val="ListParagraph"/>
+        <w:numPr>
+          <w:ilvl w:val="0"/>
+          <w:numId w:val="6"/>
+        </w:numPr>
+        <w:spacing w:line="360" w:lineRule="auto"/>
         <w:rPr>
           <w:sz w:val="24"/>
           <w:szCs w:val="24"/>
           <w:highlight w:val="yellow"/>
           <w:lang w:val="en-US"/>
         </w:rPr>
-        <w:lastRenderedPageBreak/>
-        <w:t>Hispanic</w:t>
-      </w:r>
+      </w:pPr>
       <w:r>
         <w:rPr>
           <w:sz w:val="24"/>
@@ -1032,20 +1053,17 @@
           <w:highlight w:val="yellow"/>
           <w:lang w:val="en-US"/>
         </w:rPr>
-        <w:t xml:space="preserve"> --&gt; Race and Ethnicity: Hispanic Only</w:t>
-      </w:r>
-    </w:p>
-    <w:p>
-      <w:pPr>
-        <w:spacing w:line="360" w:lineRule="auto"/>
-        <w:ind w:left="1440"/>
+        <w:t xml:space="preserve">Update 6/24/25 </w:t>
+      </w:r>
+      <w:r>
         <w:rPr>
           <w:sz w:val="24"/>
           <w:szCs w:val="24"/>
           <w:highlight w:val="yellow"/>
           <w:lang w:val="en-US"/>
         </w:rPr>
-      </w:pPr>
+        <w:sym w:font="Wingdings" w:char="F0E0"/>
+      </w:r>
       <w:r>
         <w:rPr>
           <w:sz w:val="24"/>
@@ -1053,7 +1071,7 @@
           <w:highlight w:val="yellow"/>
           <w:lang w:val="en-US"/>
         </w:rPr>
-        <w:t xml:space="preserve">***Subheadings need to be updated: Data Documentation Excel has been updated for correct headings and should match the ones above. </w:t>
+        <w:t xml:space="preserve"> expanding on “Lack of” variables and “Business Licenses”</w:t>
       </w:r>
     </w:p>
     <w:p>
@@ -1207,15 +1225,13 @@
         <w:rPr>
           <w:sz w:val="24"/>
           <w:szCs w:val="24"/>
-          <w:highlight w:val="yellow"/>
-          <w:lang w:val="en-US"/>
-        </w:rPr>
-      </w:pPr>
-      <w:r>
-        <w:rPr>
-          <w:sz w:val="24"/>
-          <w:szCs w:val="24"/>
-          <w:highlight w:val="yellow"/>
+          <w:lang w:val="en-US"/>
+        </w:rPr>
+      </w:pPr>
+      <w:r>
+        <w:rPr>
+          <w:sz w:val="24"/>
+          <w:szCs w:val="24"/>
           <w:lang w:val="en-US"/>
         </w:rPr>
         <w:t xml:space="preserve">High School Graduate --&gt; Education: High School Graduate </w:t>
@@ -1232,15 +1248,13 @@
         <w:rPr>
           <w:sz w:val="24"/>
           <w:szCs w:val="24"/>
-          <w:highlight w:val="yellow"/>
-          <w:lang w:val="en-US"/>
-        </w:rPr>
-      </w:pPr>
-      <w:r>
-        <w:rPr>
-          <w:sz w:val="24"/>
-          <w:szCs w:val="24"/>
-          <w:highlight w:val="yellow"/>
+          <w:lang w:val="en-US"/>
+        </w:rPr>
+      </w:pPr>
+      <w:r>
+        <w:rPr>
+          <w:sz w:val="24"/>
+          <w:szCs w:val="24"/>
           <w:lang w:val="en-US"/>
         </w:rPr>
         <w:t>Some College --&gt; Education: Some College</w:t>
@@ -1255,13 +1269,11 @@
         </w:numPr>
         <w:spacing w:line="360" w:lineRule="auto"/>
         <w:rPr>
-          <w:highlight w:val="yellow"/>
-          <w:lang w:val="en-US"/>
-        </w:rPr>
-      </w:pPr>
-      <w:r>
-        <w:rPr>
-          <w:highlight w:val="yellow"/>
+          <w:lang w:val="en-US"/>
+        </w:rPr>
+      </w:pPr>
+      <w:r>
+        <w:rPr>
           <w:lang w:val="en-US"/>
         </w:rPr>
         <w:t>College Graduate --&gt; Education: College Graduate</w:t>
@@ -1269,11 +1281,10 @@
     </w:p>
     <w:p>
       <w:pPr>
-        <w:spacing w:line="360" w:lineRule="auto"/>
-        <w:ind w:left="1440"/>
-        <w:rPr>
-          <w:sz w:val="24"/>
-          <w:szCs w:val="24"/>
+        <w:pStyle w:val="ListParagraph"/>
+        <w:spacing w:line="360" w:lineRule="auto"/>
+        <w:ind w:left="2160"/>
+        <w:rPr>
           <w:lang w:val="en-US"/>
         </w:rPr>
       </w:pPr>
@@ -1405,14 +1416,12 @@
           <w:bCs/>
           <w:sz w:val="24"/>
           <w:szCs w:val="24"/>
-          <w:highlight w:val="yellow"/>
-        </w:rPr>
-      </w:pPr>
-      <w:r>
-        <w:rPr>
-          <w:sz w:val="24"/>
-          <w:szCs w:val="24"/>
-          <w:highlight w:val="yellow"/>
+        </w:rPr>
+      </w:pPr>
+      <w:r>
+        <w:rPr>
+          <w:sz w:val="24"/>
+          <w:szCs w:val="24"/>
         </w:rPr>
         <w:t>Adjust y axis for the following determinants</w:t>
       </w:r>
@@ -1430,45 +1439,30 @@
           <w:bCs/>
           <w:sz w:val="24"/>
           <w:szCs w:val="24"/>
-          <w:highlight w:val="yellow"/>
-          <w:lang w:val="en-US"/>
-        </w:rPr>
-      </w:pPr>
-      <w:r>
-        <w:rPr>
-          <w:sz w:val="24"/>
-          <w:szCs w:val="24"/>
-          <w:highlight w:val="yellow"/>
-          <w:lang w:val="en-US"/>
-        </w:rPr>
-        <w:t xml:space="preserve">Lack of Complete </w:t>
-      </w:r>
-      <w:proofErr w:type="gramStart"/>
-      <w:r>
-        <w:rPr>
-          <w:sz w:val="24"/>
-          <w:szCs w:val="24"/>
-          <w:highlight w:val="yellow"/>
-          <w:lang w:val="en-US"/>
-        </w:rPr>
-        <w:t xml:space="preserve">Kitchen  </w:t>
+          <w:lang w:val="en-US"/>
+        </w:rPr>
+      </w:pPr>
+      <w:r>
+        <w:rPr>
+          <w:sz w:val="24"/>
+          <w:szCs w:val="24"/>
+          <w:lang w:val="en-US"/>
+        </w:rPr>
+        <w:t xml:space="preserve">Lack of Complete Kitchen  </w:t>
       </w:r>
       <w:r>
         <w:rPr>
           <w:rFonts w:ascii="Wingdings" w:eastAsia="Wingdings" w:hAnsi="Wingdings" w:cs="Wingdings"/>
           <w:sz w:val="24"/>
           <w:szCs w:val="24"/>
-          <w:highlight w:val="yellow"/>
           <w:lang w:val="en-US"/>
         </w:rPr>
         <w:t>à</w:t>
       </w:r>
-      <w:proofErr w:type="gramEnd"/>
-      <w:r>
-        <w:rPr>
-          <w:sz w:val="24"/>
-          <w:szCs w:val="24"/>
-          <w:highlight w:val="yellow"/>
+      <w:r>
+        <w:rPr>
+          <w:sz w:val="24"/>
+          <w:szCs w:val="24"/>
           <w:lang w:val="en-US"/>
         </w:rPr>
         <w:t xml:space="preserve"> expand to 10%</w:t>
@@ -1485,14 +1479,12 @@
         <w:rPr>
           <w:b/>
           <w:bCs/>
-          <w:highlight w:val="yellow"/>
-        </w:rPr>
-      </w:pPr>
-      <w:r>
-        <w:rPr>
-          <w:sz w:val="24"/>
-          <w:szCs w:val="24"/>
-          <w:highlight w:val="yellow"/>
+        </w:rPr>
+      </w:pPr>
+      <w:r>
+        <w:rPr>
+          <w:sz w:val="24"/>
+          <w:szCs w:val="24"/>
         </w:rPr>
         <w:t xml:space="preserve">Lack of Complete Plumbing </w:t>
       </w:r>
@@ -1501,7 +1493,6 @@
           <w:rFonts w:ascii="Wingdings" w:eastAsia="Wingdings" w:hAnsi="Wingdings" w:cs="Wingdings"/>
           <w:sz w:val="24"/>
           <w:szCs w:val="24"/>
-          <w:highlight w:val="yellow"/>
         </w:rPr>
         <w:t>à</w:t>
       </w:r>
@@ -1509,7 +1500,6 @@
         <w:rPr>
           <w:sz w:val="24"/>
           <w:szCs w:val="24"/>
-          <w:highlight w:val="yellow"/>
         </w:rPr>
         <w:t xml:space="preserve"> expand to 10%</w:t>
       </w:r>
@@ -1527,14 +1517,12 @@
           <w:bCs/>
           <w:sz w:val="24"/>
           <w:szCs w:val="24"/>
-          <w:highlight w:val="yellow"/>
-        </w:rPr>
-      </w:pPr>
-      <w:r>
-        <w:rPr>
-          <w:sz w:val="24"/>
-          <w:szCs w:val="24"/>
-          <w:highlight w:val="yellow"/>
+        </w:rPr>
+      </w:pPr>
+      <w:r>
+        <w:rPr>
+          <w:sz w:val="24"/>
+          <w:szCs w:val="24"/>
         </w:rPr>
         <w:t xml:space="preserve">Native American </w:t>
       </w:r>
@@ -1543,7 +1531,6 @@
           <w:rFonts w:ascii="Wingdings" w:eastAsia="Wingdings" w:hAnsi="Wingdings" w:cs="Wingdings"/>
           <w:sz w:val="24"/>
           <w:szCs w:val="24"/>
-          <w:highlight w:val="yellow"/>
         </w:rPr>
         <w:t>à</w:t>
       </w:r>
@@ -1551,7 +1538,6 @@
         <w:rPr>
           <w:sz w:val="24"/>
           <w:szCs w:val="24"/>
-          <w:highlight w:val="yellow"/>
         </w:rPr>
         <w:t xml:space="preserve"> expand to 1%</w:t>
       </w:r>
@@ -1569,6 +1555,44 @@
           <w:bCs/>
           <w:sz w:val="24"/>
           <w:szCs w:val="24"/>
+        </w:rPr>
+      </w:pPr>
+      <w:r>
+        <w:rPr>
+          <w:sz w:val="24"/>
+          <w:szCs w:val="24"/>
+        </w:rPr>
+        <w:t xml:space="preserve">Pacific Islander </w:t>
+      </w:r>
+      <w:r>
+        <w:rPr>
+          <w:rFonts w:ascii="Wingdings" w:eastAsia="Wingdings" w:hAnsi="Wingdings" w:cs="Wingdings"/>
+          <w:sz w:val="24"/>
+          <w:szCs w:val="24"/>
+        </w:rPr>
+        <w:t>à</w:t>
+      </w:r>
+      <w:r>
+        <w:rPr>
+          <w:sz w:val="24"/>
+          <w:szCs w:val="24"/>
+        </w:rPr>
+        <w:t xml:space="preserve"> expand to 1%</w:t>
+      </w:r>
+    </w:p>
+    <w:p>
+      <w:pPr>
+        <w:pStyle w:val="ListParagraph"/>
+        <w:numPr>
+          <w:ilvl w:val="1"/>
+          <w:numId w:val="3"/>
+        </w:numPr>
+        <w:spacing w:line="360" w:lineRule="auto"/>
+        <w:rPr>
+          <w:b/>
+          <w:bCs/>
+          <w:sz w:val="24"/>
+          <w:szCs w:val="24"/>
           <w:highlight w:val="yellow"/>
         </w:rPr>
       </w:pPr>
@@ -1578,16 +1602,15 @@
           <w:szCs w:val="24"/>
           <w:highlight w:val="yellow"/>
         </w:rPr>
-        <w:t xml:space="preserve">Pacific Islander </w:t>
-      </w:r>
-      <w:r>
-        <w:rPr>
-          <w:rFonts w:ascii="Wingdings" w:eastAsia="Wingdings" w:hAnsi="Wingdings" w:cs="Wingdings"/>
+        <w:t>Please check City Wide Average variable for “Median Age,” “Lack of Complete Kitchen,” “Lack of Complete Plumbing,” “Race and Ethnicity: Pacific Islander”</w:t>
+      </w:r>
+      <w:r>
+        <w:rPr>
           <w:sz w:val="24"/>
           <w:szCs w:val="24"/>
           <w:highlight w:val="yellow"/>
         </w:rPr>
-        <w:t>à</w:t>
+        <w:t xml:space="preserve"> </w:t>
       </w:r>
       <w:r>
         <w:rPr>
@@ -1595,7 +1618,15 @@
           <w:szCs w:val="24"/>
           <w:highlight w:val="yellow"/>
         </w:rPr>
-        <w:t xml:space="preserve"> expand to 1%</w:t>
+        <w:sym w:font="Wingdings" w:char="F0E0"/>
+      </w:r>
+      <w:r>
+        <w:rPr>
+          <w:sz w:val="24"/>
+          <w:szCs w:val="24"/>
+          <w:highlight w:val="yellow"/>
+        </w:rPr>
+        <w:t xml:space="preserve"> the number is hidden behind the shown estimates. </w:t>
       </w:r>
     </w:p>
     <w:p>
@@ -1650,6 +1681,7 @@
           <w:sz w:val="24"/>
           <w:szCs w:val="24"/>
         </w:rPr>
+        <w:lastRenderedPageBreak/>
         <w:t xml:space="preserve">It would also be if you select a district, the bar graph color changes for the district you selected to highlight it better. </w:t>
       </w:r>
     </w:p>
@@ -1684,16 +1716,7 @@
           <w:szCs w:val="24"/>
           <w:lang w:val="en-US"/>
         </w:rPr>
-        <w:t xml:space="preserve">The only determinant of health that should not have a bar graph is Heat Vulnerability Index. The range is from negative to positive, so a bar graph will not look right. The scale should be from Very Low to Very High Risk and would best </w:t>
-      </w:r>
-      <w:r>
-        <w:rPr>
-          <w:sz w:val="24"/>
-          <w:szCs w:val="24"/>
-          <w:lang w:val="en-US"/>
-        </w:rPr>
-        <w:lastRenderedPageBreak/>
-        <w:t>be shown with graduated colors on the spatial map only. An example is shown below.</w:t>
+        <w:t>The only determinant of health that should not have a bar graph is Heat Vulnerability Index. The range is from negative to positive, so a bar graph will not look right. The scale should be from Very Low to Very High Risk and would best be shown with graduated colors on the spatial map only. An example is shown below.</w:t>
       </w:r>
     </w:p>
     <w:p>
@@ -1707,15 +1730,13 @@
         <w:rPr>
           <w:b/>
           <w:bCs/>
-          <w:highlight w:val="yellow"/>
-          <w:lang w:val="en-US"/>
-        </w:rPr>
-      </w:pPr>
-      <w:r>
-        <w:rPr>
-          <w:sz w:val="24"/>
-          <w:szCs w:val="24"/>
-          <w:highlight w:val="yellow"/>
+          <w:lang w:val="en-US"/>
+        </w:rPr>
+      </w:pPr>
+      <w:r>
+        <w:rPr>
+          <w:sz w:val="24"/>
+          <w:szCs w:val="24"/>
           <w:lang w:val="en-US"/>
         </w:rPr>
         <w:t xml:space="preserve">Also, an explanation as to what the Heat Vulnerability Index is measuring could take the place of the bar graph </w:t>
@@ -1725,7 +1746,6 @@
           <w:rFonts w:ascii="Wingdings" w:eastAsia="Wingdings" w:hAnsi="Wingdings" w:cs="Wingdings"/>
           <w:sz w:val="24"/>
           <w:szCs w:val="24"/>
-          <w:highlight w:val="yellow"/>
           <w:lang w:val="en-US"/>
         </w:rPr>
         <w:t>à</w:t>
@@ -1734,7 +1754,6 @@
         <w:rPr>
           <w:sz w:val="24"/>
           <w:szCs w:val="24"/>
-          <w:highlight w:val="yellow"/>
           <w:lang w:val="en-US"/>
         </w:rPr>
         <w:t xml:space="preserve"> maybe in the subheading section. It can say. </w:t>
@@ -1751,15 +1770,13 @@
         <w:rPr>
           <w:b/>
           <w:bCs/>
-          <w:highlight w:val="yellow"/>
-          <w:lang w:val="en-US"/>
-        </w:rPr>
-      </w:pPr>
-      <w:r>
-        <w:rPr>
-          <w:sz w:val="24"/>
-          <w:szCs w:val="24"/>
-          <w:highlight w:val="yellow"/>
+          <w:lang w:val="en-US"/>
+        </w:rPr>
+      </w:pPr>
+      <w:r>
+        <w:rPr>
+          <w:sz w:val="24"/>
+          <w:szCs w:val="24"/>
           <w:lang w:val="en-US"/>
         </w:rPr>
         <w:t xml:space="preserve">The Heat Vulnerability Index (HVI) is a composite measure that summarizes key indicators associated with negative health outcomes due to extreme heat exposure. The HVI scale ranges from negative to positive values, which represent areas of very low to very high vulnerability. Because of this range, a </w:t>
@@ -1768,7 +1785,6 @@
         <w:rPr>
           <w:sz w:val="24"/>
           <w:szCs w:val="24"/>
-          <w:highlight w:val="yellow"/>
           <w:lang w:val="en-US"/>
         </w:rPr>
         <w:t xml:space="preserve">choropleth </w:t>
@@ -1777,7 +1793,6 @@
         <w:rPr>
           <w:sz w:val="24"/>
           <w:szCs w:val="24"/>
-          <w:highlight w:val="yellow"/>
           <w:lang w:val="en-US"/>
         </w:rPr>
         <w:t>map</w:t>
@@ -1786,7 +1801,6 @@
         <w:rPr>
           <w:sz w:val="24"/>
           <w:szCs w:val="24"/>
-          <w:highlight w:val="yellow"/>
           <w:lang w:val="en-US"/>
         </w:rPr>
         <w:t>, rather than a bar graph,</w:t>
@@ -1795,7 +1809,6 @@
         <w:rPr>
           <w:sz w:val="24"/>
           <w:szCs w:val="24"/>
-          <w:highlight w:val="yellow"/>
           <w:lang w:val="en-US"/>
         </w:rPr>
         <w:t xml:space="preserve"> </w:t>
@@ -1804,7 +1817,6 @@
         <w:rPr>
           <w:sz w:val="24"/>
           <w:szCs w:val="24"/>
-          <w:highlight w:val="yellow"/>
           <w:lang w:val="en-US"/>
         </w:rPr>
         <w:t>is</w:t>
@@ -1813,7 +1825,6 @@
         <w:rPr>
           <w:sz w:val="24"/>
           <w:szCs w:val="24"/>
-          <w:highlight w:val="yellow"/>
           <w:lang w:val="en-US"/>
         </w:rPr>
         <w:t xml:space="preserve"> best suited to effectively convey patterns of heat-related health risk across geographic areas</w:t>
@@ -1921,18 +1932,17 @@
         <w:rPr>
           <w:lang w:val="en-US"/>
         </w:rPr>
+        <w:lastRenderedPageBreak/>
         <w:t xml:space="preserve">Also, Data documentation (currently an excel file) we would like to embed into the dashboard. </w:t>
       </w:r>
       <w:r>
         <w:rPr>
-          <w:highlight w:val="yellow"/>
           <w:lang w:val="en-US"/>
         </w:rPr>
         <w:t>If people click on it, it should pull up the excel (see “About the data” bullet below). </w:t>
       </w:r>
       <w:r>
         <w:rPr>
-          <w:highlight w:val="yellow"/>
           <w:lang w:val="en-US"/>
         </w:rPr>
         <w:t>And the ability to Download data used in the Dashboard</w:t>
@@ -1991,7 +2001,6 @@
           <w:sz w:val="24"/>
           <w:szCs w:val="24"/>
         </w:rPr>
-        <w:lastRenderedPageBreak/>
         <w:t xml:space="preserve">Rough </w:t>
       </w:r>
       <w:r>
@@ -2037,7 +2046,7 @@
           <w:szCs w:val="24"/>
         </w:rPr>
         <w:drawing>
-          <wp:inline distT="0" distB="0" distL="0" distR="0" wp14:anchorId="10D99632" wp14:editId="5155E2D0">
+          <wp:inline distT="0" distB="0" distL="0" distR="0" wp14:anchorId="10D99632" wp14:editId="5FEC5814">
             <wp:extent cx="5989515" cy="4866481"/>
             <wp:effectExtent l="0" t="0" r="0" b="0"/>
             <wp:docPr id="1603832358" name="Picture 1"/>
@@ -2167,6 +2176,7 @@
           <w:szCs w:val="24"/>
           <w:lang w:val="en-US"/>
         </w:rPr>
+        <w:lastRenderedPageBreak/>
         <w:t xml:space="preserve">E.g. </w:t>
       </w:r>
       <w:r>
@@ -2244,9 +2254,7 @@
         <w:rPr>
           <w:sz w:val="24"/>
           <w:szCs w:val="24"/>
-          <w:highlight w:val="yellow"/>
-        </w:rPr>
-        <w:lastRenderedPageBreak/>
+        </w:rPr>
         <w:t>This dashboard is a work in progress. The last update took place on [DATE]</w:t>
       </w:r>
     </w:p>
@@ -2384,7 +2392,6 @@
           <w:bCs/>
           <w:sz w:val="24"/>
           <w:szCs w:val="24"/>
-          <w:highlight w:val="yellow"/>
         </w:rPr>
         <w:t>Sponsor:</w:t>
       </w:r>
@@ -2392,7 +2399,6 @@
         <w:rPr>
           <w:sz w:val="24"/>
           <w:szCs w:val="24"/>
-          <w:highlight w:val="yellow"/>
         </w:rPr>
         <w:t xml:space="preserve"> </w:t>
       </w:r>
@@ -2400,7 +2406,6 @@
         <w:rPr>
           <w:sz w:val="24"/>
           <w:szCs w:val="24"/>
-          <w:highlight w:val="yellow"/>
         </w:rPr>
         <w:t>This project received funding from the Transform Academia for Equity grant from Robert Wood Johnson Foundation</w:t>
       </w:r>
@@ -2800,51 +2805,7 @@
             <w:szCs w:val="20"/>
             <w:shd w:val="clear" w:color="auto" w:fill="FFFFFF"/>
           </w:rPr>
-          <w:t xml:space="preserve">. </w:t>
-        </w:r>
-        <w:proofErr w:type="gramStart"/>
-        <w:r>
-          <w:rPr>
-            <w:rStyle w:val="Hyperlink"/>
-            <w:rFonts w:ascii="Calibri" w:hAnsi="Calibri" w:cs="Calibri"/>
-            <w:sz w:val="20"/>
-            <w:szCs w:val="20"/>
-            <w:shd w:val="clear" w:color="auto" w:fill="FFFFFF"/>
-          </w:rPr>
-          <w:t>2023;24:101511</w:t>
-        </w:r>
-        <w:proofErr w:type="gramEnd"/>
-        <w:r>
-          <w:rPr>
-            <w:rStyle w:val="Hyperlink"/>
-            <w:rFonts w:ascii="Calibri" w:hAnsi="Calibri" w:cs="Calibri"/>
-            <w:sz w:val="20"/>
-            <w:szCs w:val="20"/>
-            <w:shd w:val="clear" w:color="auto" w:fill="FFFFFF"/>
-          </w:rPr>
-          <w:t xml:space="preserve">. Published 2023 Sep 4. </w:t>
-        </w:r>
-        <w:proofErr w:type="gramStart"/>
-        <w:r>
-          <w:rPr>
-            <w:rStyle w:val="Hyperlink"/>
-            <w:rFonts w:ascii="Calibri" w:hAnsi="Calibri" w:cs="Calibri"/>
-            <w:sz w:val="20"/>
-            <w:szCs w:val="20"/>
-            <w:shd w:val="clear" w:color="auto" w:fill="FFFFFF"/>
-          </w:rPr>
-          <w:t>doi:10.1016/j.ssmph</w:t>
-        </w:r>
-        <w:proofErr w:type="gramEnd"/>
-        <w:r>
-          <w:rPr>
-            <w:rStyle w:val="Hyperlink"/>
-            <w:rFonts w:ascii="Calibri" w:hAnsi="Calibri" w:cs="Calibri"/>
-            <w:sz w:val="20"/>
-            <w:szCs w:val="20"/>
-            <w:shd w:val="clear" w:color="auto" w:fill="FFFFFF"/>
-          </w:rPr>
-          <w:t>.2023.101511</w:t>
+          <w:t>. 2023;24:101511. Published 2023 Sep 4. doi:10.1016/j.ssmph.2023.101511</w:t>
         </w:r>
       </w:hyperlink>
     </w:p>
@@ -3102,15 +3063,7 @@
           <w:sz w:val="24"/>
           <w:szCs w:val="24"/>
         </w:rPr>
-        <w:t xml:space="preserve">The goal of this </w:t>
-      </w:r>
-      <w:r>
-        <w:rPr>
-          <w:sz w:val="24"/>
-          <w:szCs w:val="24"/>
-        </w:rPr>
-        <w:lastRenderedPageBreak/>
-        <w:t xml:space="preserve">dashboard is to inform </w:t>
+        <w:t xml:space="preserve">The goal of this dashboard is to inform </w:t>
       </w:r>
       <w:r>
         <w:rPr>
@@ -3585,15 +3538,15 @@
     </w:lvl>
   </w:abstractNum>
   <w:abstractNum w:abstractNumId="1" w15:restartNumberingAfterBreak="0">
-    <w:nsid w:val="368C4B2A"/>
+    <w:nsid w:val="0D6B621B"/>
     <w:multiLevelType w:val="hybridMultilevel"/>
-    <w:tmpl w:val="7842158C"/>
-    <w:lvl w:ilvl="0" w:tplc="F1B0A3B2">
+    <w:tmpl w:val="997A540E"/>
+    <w:lvl w:ilvl="0" w:tplc="4B4AD23A">
       <w:numFmt w:val="bullet"/>
       <w:lvlText w:val="-"/>
       <w:lvlJc w:val="left"/>
       <w:pPr>
-        <w:ind w:left="720" w:hanging="360"/>
+        <w:ind w:left="2520" w:hanging="360"/>
       </w:pPr>
       <w:rPr>
         <w:rFonts w:ascii="Arial" w:eastAsia="Arial" w:hAnsi="Arial" w:cs="Arial" w:hint="default"/>
@@ -3605,7 +3558,7 @@
       <w:lvlText w:val="o"/>
       <w:lvlJc w:val="left"/>
       <w:pPr>
-        <w:ind w:left="1440" w:hanging="360"/>
+        <w:ind w:left="3240" w:hanging="360"/>
       </w:pPr>
       <w:rPr>
         <w:rFonts w:ascii="Courier New" w:hAnsi="Courier New" w:cs="Courier New" w:hint="default"/>
@@ -3617,7 +3570,7 @@
       <w:lvlText w:val=""/>
       <w:lvlJc w:val="left"/>
       <w:pPr>
-        <w:ind w:left="2160" w:hanging="360"/>
+        <w:ind w:left="3960" w:hanging="360"/>
       </w:pPr>
       <w:rPr>
         <w:rFonts w:ascii="Wingdings" w:hAnsi="Wingdings" w:hint="default"/>
@@ -3629,7 +3582,7 @@
       <w:lvlText w:val=""/>
       <w:lvlJc w:val="left"/>
       <w:pPr>
-        <w:ind w:left="2880" w:hanging="360"/>
+        <w:ind w:left="4680" w:hanging="360"/>
       </w:pPr>
       <w:rPr>
         <w:rFonts w:ascii="Symbol" w:hAnsi="Symbol" w:hint="default"/>
@@ -3641,7 +3594,7 @@
       <w:lvlText w:val="o"/>
       <w:lvlJc w:val="left"/>
       <w:pPr>
-        <w:ind w:left="3600" w:hanging="360"/>
+        <w:ind w:left="5400" w:hanging="360"/>
       </w:pPr>
       <w:rPr>
         <w:rFonts w:ascii="Courier New" w:hAnsi="Courier New" w:cs="Courier New" w:hint="default"/>
@@ -3653,7 +3606,7 @@
       <w:lvlText w:val=""/>
       <w:lvlJc w:val="left"/>
       <w:pPr>
-        <w:ind w:left="4320" w:hanging="360"/>
+        <w:ind w:left="6120" w:hanging="360"/>
       </w:pPr>
       <w:rPr>
         <w:rFonts w:ascii="Wingdings" w:hAnsi="Wingdings" w:hint="default"/>
@@ -3665,7 +3618,7 @@
       <w:lvlText w:val=""/>
       <w:lvlJc w:val="left"/>
       <w:pPr>
-        <w:ind w:left="5040" w:hanging="360"/>
+        <w:ind w:left="6840" w:hanging="360"/>
       </w:pPr>
       <w:rPr>
         <w:rFonts w:ascii="Symbol" w:hAnsi="Symbol" w:hint="default"/>
@@ -3677,7 +3630,7 @@
       <w:lvlText w:val="o"/>
       <w:lvlJc w:val="left"/>
       <w:pPr>
-        <w:ind w:left="5760" w:hanging="360"/>
+        <w:ind w:left="7560" w:hanging="360"/>
       </w:pPr>
       <w:rPr>
         <w:rFonts w:ascii="Courier New" w:hAnsi="Courier New" w:cs="Courier New" w:hint="default"/>
@@ -3689,7 +3642,7 @@
       <w:lvlText w:val=""/>
       <w:lvlJc w:val="left"/>
       <w:pPr>
-        <w:ind w:left="6480" w:hanging="360"/>
+        <w:ind w:left="8280" w:hanging="360"/>
       </w:pPr>
       <w:rPr>
         <w:rFonts w:ascii="Wingdings" w:hAnsi="Wingdings" w:hint="default"/>
@@ -3697,6 +3650,118 @@
     </w:lvl>
   </w:abstractNum>
   <w:abstractNum w:abstractNumId="2" w15:restartNumberingAfterBreak="0">
+    <w:nsid w:val="368C4B2A"/>
+    <w:multiLevelType w:val="hybridMultilevel"/>
+    <w:tmpl w:val="7842158C"/>
+    <w:lvl w:ilvl="0" w:tplc="F1B0A3B2">
+      <w:numFmt w:val="bullet"/>
+      <w:lvlText w:val="-"/>
+      <w:lvlJc w:val="left"/>
+      <w:pPr>
+        <w:ind w:left="720" w:hanging="360"/>
+      </w:pPr>
+      <w:rPr>
+        <w:rFonts w:ascii="Arial" w:eastAsia="Arial" w:hAnsi="Arial" w:cs="Arial" w:hint="default"/>
+      </w:rPr>
+    </w:lvl>
+    <w:lvl w:ilvl="1" w:tplc="04090003" w:tentative="1">
+      <w:start w:val="1"/>
+      <w:numFmt w:val="bullet"/>
+      <w:lvlText w:val="o"/>
+      <w:lvlJc w:val="left"/>
+      <w:pPr>
+        <w:ind w:left="1440" w:hanging="360"/>
+      </w:pPr>
+      <w:rPr>
+        <w:rFonts w:ascii="Courier New" w:hAnsi="Courier New" w:cs="Courier New" w:hint="default"/>
+      </w:rPr>
+    </w:lvl>
+    <w:lvl w:ilvl="2" w:tplc="04090005" w:tentative="1">
+      <w:start w:val="1"/>
+      <w:numFmt w:val="bullet"/>
+      <w:lvlText w:val=""/>
+      <w:lvlJc w:val="left"/>
+      <w:pPr>
+        <w:ind w:left="2160" w:hanging="360"/>
+      </w:pPr>
+      <w:rPr>
+        <w:rFonts w:ascii="Wingdings" w:hAnsi="Wingdings" w:hint="default"/>
+      </w:rPr>
+    </w:lvl>
+    <w:lvl w:ilvl="3" w:tplc="04090001" w:tentative="1">
+      <w:start w:val="1"/>
+      <w:numFmt w:val="bullet"/>
+      <w:lvlText w:val=""/>
+      <w:lvlJc w:val="left"/>
+      <w:pPr>
+        <w:ind w:left="2880" w:hanging="360"/>
+      </w:pPr>
+      <w:rPr>
+        <w:rFonts w:ascii="Symbol" w:hAnsi="Symbol" w:hint="default"/>
+      </w:rPr>
+    </w:lvl>
+    <w:lvl w:ilvl="4" w:tplc="04090003" w:tentative="1">
+      <w:start w:val="1"/>
+      <w:numFmt w:val="bullet"/>
+      <w:lvlText w:val="o"/>
+      <w:lvlJc w:val="left"/>
+      <w:pPr>
+        <w:ind w:left="3600" w:hanging="360"/>
+      </w:pPr>
+      <w:rPr>
+        <w:rFonts w:ascii="Courier New" w:hAnsi="Courier New" w:cs="Courier New" w:hint="default"/>
+      </w:rPr>
+    </w:lvl>
+    <w:lvl w:ilvl="5" w:tplc="04090005" w:tentative="1">
+      <w:start w:val="1"/>
+      <w:numFmt w:val="bullet"/>
+      <w:lvlText w:val=""/>
+      <w:lvlJc w:val="left"/>
+      <w:pPr>
+        <w:ind w:left="4320" w:hanging="360"/>
+      </w:pPr>
+      <w:rPr>
+        <w:rFonts w:ascii="Wingdings" w:hAnsi="Wingdings" w:hint="default"/>
+      </w:rPr>
+    </w:lvl>
+    <w:lvl w:ilvl="6" w:tplc="04090001" w:tentative="1">
+      <w:start w:val="1"/>
+      <w:numFmt w:val="bullet"/>
+      <w:lvlText w:val=""/>
+      <w:lvlJc w:val="left"/>
+      <w:pPr>
+        <w:ind w:left="5040" w:hanging="360"/>
+      </w:pPr>
+      <w:rPr>
+        <w:rFonts w:ascii="Symbol" w:hAnsi="Symbol" w:hint="default"/>
+      </w:rPr>
+    </w:lvl>
+    <w:lvl w:ilvl="7" w:tplc="04090003" w:tentative="1">
+      <w:start w:val="1"/>
+      <w:numFmt w:val="bullet"/>
+      <w:lvlText w:val="o"/>
+      <w:lvlJc w:val="left"/>
+      <w:pPr>
+        <w:ind w:left="5760" w:hanging="360"/>
+      </w:pPr>
+      <w:rPr>
+        <w:rFonts w:ascii="Courier New" w:hAnsi="Courier New" w:cs="Courier New" w:hint="default"/>
+      </w:rPr>
+    </w:lvl>
+    <w:lvl w:ilvl="8" w:tplc="04090005" w:tentative="1">
+      <w:start w:val="1"/>
+      <w:numFmt w:val="bullet"/>
+      <w:lvlText w:val=""/>
+      <w:lvlJc w:val="left"/>
+      <w:pPr>
+        <w:ind w:left="6480" w:hanging="360"/>
+      </w:pPr>
+      <w:rPr>
+        <w:rFonts w:ascii="Wingdings" w:hAnsi="Wingdings" w:hint="default"/>
+      </w:rPr>
+    </w:lvl>
+  </w:abstractNum>
+  <w:abstractNum w:abstractNumId="3" w15:restartNumberingAfterBreak="0">
     <w:nsid w:val="369413AD"/>
     <w:multiLevelType w:val="hybridMultilevel"/>
     <w:tmpl w:val="0C8A6E70"/>
@@ -3809,7 +3874,7 @@
       </w:rPr>
     </w:lvl>
   </w:abstractNum>
-  <w:abstractNum w:abstractNumId="3" w15:restartNumberingAfterBreak="0">
+  <w:abstractNum w:abstractNumId="4" w15:restartNumberingAfterBreak="0">
     <w:nsid w:val="7B583318"/>
     <w:multiLevelType w:val="hybridMultilevel"/>
     <w:tmpl w:val="263AEE22"/>
@@ -3921,7 +3986,7 @@
       </w:rPr>
     </w:lvl>
   </w:abstractNum>
-  <w:abstractNum w:abstractNumId="4" w15:restartNumberingAfterBreak="0">
+  <w:abstractNum w:abstractNumId="5" w15:restartNumberingAfterBreak="0">
     <w:nsid w:val="7F9846AF"/>
     <w:multiLevelType w:val="hybridMultilevel"/>
     <w:tmpl w:val="12905E42"/>
@@ -4035,19 +4100,22 @@
     </w:lvl>
   </w:abstractNum>
   <w:num w:numId="1" w16cid:durableId="388575571">
+    <w:abstractNumId w:val="4"/>
+  </w:num>
+  <w:num w:numId="2" w16cid:durableId="702705117">
+    <w:abstractNumId w:val="2"/>
+  </w:num>
+  <w:num w:numId="3" w16cid:durableId="2040356094">
     <w:abstractNumId w:val="3"/>
   </w:num>
-  <w:num w:numId="2" w16cid:durableId="702705117">
-    <w:abstractNumId w:val="1"/>
-  </w:num>
-  <w:num w:numId="3" w16cid:durableId="2040356094">
-    <w:abstractNumId w:val="2"/>
-  </w:num>
   <w:num w:numId="4" w16cid:durableId="636842548">
-    <w:abstractNumId w:val="4"/>
+    <w:abstractNumId w:val="5"/>
   </w:num>
   <w:num w:numId="5" w16cid:durableId="1055155573">
     <w:abstractNumId w:val="0"/>
+  </w:num>
+  <w:num w:numId="6" w16cid:durableId="394165650">
+    <w:abstractNumId w:val="1"/>
   </w:num>
 </w:numbering>
 </file>

</xml_diff>

<commit_message>
Updated PRD and Excel of Variables for dashboard updates
all changes to both documents have been highlighted in Yellow
</commit_message>
<xml_diff>
--- a/Data/Variables and PPT/PRD IDEA Fellowship.docx
+++ b/Data/Variables and PPT/PRD IDEA Fellowship.docx
@@ -724,6 +724,103 @@
         </w:numPr>
         <w:spacing w:line="360" w:lineRule="auto"/>
         <w:rPr>
+          <w:b/>
+          <w:sz w:val="24"/>
+          <w:szCs w:val="24"/>
+          <w:highlight w:val="yellow"/>
+        </w:rPr>
+      </w:pPr>
+      <w:r>
+        <w:rPr>
+          <w:sz w:val="24"/>
+          <w:szCs w:val="24"/>
+          <w:highlight w:val="yellow"/>
+        </w:rPr>
+        <w:t>Rename “Active Business Licenses No Rentals” to “Active Business Licenses (Excluding Rental Business Licenses)</w:t>
+      </w:r>
+    </w:p>
+    <w:p>
+      <w:pPr>
+        <w:pStyle w:val="ListParagraph"/>
+        <w:numPr>
+          <w:ilvl w:val="1"/>
+          <w:numId w:val="3"/>
+        </w:numPr>
+        <w:spacing w:line="360" w:lineRule="auto"/>
+        <w:rPr>
+          <w:b/>
+          <w:sz w:val="24"/>
+          <w:szCs w:val="24"/>
+          <w:highlight w:val="yellow"/>
+        </w:rPr>
+      </w:pPr>
+      <w:r>
+        <w:rPr>
+          <w:sz w:val="24"/>
+          <w:szCs w:val="24"/>
+          <w:highlight w:val="yellow"/>
+        </w:rPr>
+        <w:t>Rename “Active Business Licenses Rentals Only” to “Active Rental Business Licenses”</w:t>
+      </w:r>
+    </w:p>
+    <w:p>
+      <w:pPr>
+        <w:pStyle w:val="ListParagraph"/>
+        <w:numPr>
+          <w:ilvl w:val="1"/>
+          <w:numId w:val="3"/>
+        </w:numPr>
+        <w:spacing w:line="360" w:lineRule="auto"/>
+        <w:rPr>
+          <w:b/>
+          <w:sz w:val="24"/>
+          <w:szCs w:val="24"/>
+          <w:highlight w:val="yellow"/>
+        </w:rPr>
+      </w:pPr>
+      <w:r>
+        <w:rPr>
+          <w:sz w:val="24"/>
+          <w:szCs w:val="24"/>
+          <w:highlight w:val="yellow"/>
+        </w:rPr>
+        <w:t xml:space="preserve">Rename “Lack Complete Kitchen” to “Housing Quality: Lacking Complete Kitchen Facilities” </w:t>
+      </w:r>
+    </w:p>
+    <w:p>
+      <w:pPr>
+        <w:pStyle w:val="ListParagraph"/>
+        <w:numPr>
+          <w:ilvl w:val="1"/>
+          <w:numId w:val="3"/>
+        </w:numPr>
+        <w:spacing w:line="360" w:lineRule="auto"/>
+        <w:rPr>
+          <w:b/>
+          <w:sz w:val="24"/>
+          <w:szCs w:val="24"/>
+          <w:highlight w:val="yellow"/>
+        </w:rPr>
+      </w:pPr>
+      <w:r>
+        <w:rPr>
+          <w:sz w:val="24"/>
+          <w:szCs w:val="24"/>
+          <w:highlight w:val="yellow"/>
+        </w:rPr>
+        <w:lastRenderedPageBreak/>
+        <w:t xml:space="preserve">Rename “Lack Complete Plumbing” to “Housing Quality: Lacking Complete Plumbing Facilities” </w:t>
+      </w:r>
+    </w:p>
+    <w:p>
+      <w:pPr>
+        <w:pStyle w:val="ListParagraph"/>
+        <w:numPr>
+          <w:ilvl w:val="1"/>
+          <w:numId w:val="3"/>
+        </w:numPr>
+        <w:spacing w:line="360" w:lineRule="auto"/>
+        <w:rPr>
           <w:sz w:val="24"/>
           <w:szCs w:val="24"/>
           <w:lang w:val="en-US"/>
@@ -960,7 +1057,6 @@
           <w:szCs w:val="24"/>
           <w:lang w:val="en-US"/>
         </w:rPr>
-        <w:lastRenderedPageBreak/>
         <w:t xml:space="preserve">Two or More Races --&gt; Race and Ethnicity: </w:t>
       </w:r>
       <w:r>
@@ -1053,7 +1149,25 @@
           <w:highlight w:val="yellow"/>
           <w:lang w:val="en-US"/>
         </w:rPr>
-        <w:t xml:space="preserve">Update 6/24/25 </w:t>
+        <w:t>Update 6/2</w:t>
+      </w:r>
+      <w:r>
+        <w:rPr>
+          <w:sz w:val="24"/>
+          <w:szCs w:val="24"/>
+          <w:highlight w:val="yellow"/>
+          <w:lang w:val="en-US"/>
+        </w:rPr>
+        <w:t>8</w:t>
+      </w:r>
+      <w:r>
+        <w:rPr>
+          <w:sz w:val="24"/>
+          <w:szCs w:val="24"/>
+          <w:highlight w:val="yellow"/>
+          <w:lang w:val="en-US"/>
+        </w:rPr>
+        <w:t xml:space="preserve">/25 </w:t>
       </w:r>
       <w:r>
         <w:rPr>
@@ -1448,7 +1562,17 @@
           <w:szCs w:val="24"/>
           <w:lang w:val="en-US"/>
         </w:rPr>
-        <w:t xml:space="preserve">Lack of Complete Kitchen  </w:t>
+        <w:lastRenderedPageBreak/>
+        <w:t xml:space="preserve">Lack of Complete </w:t>
+      </w:r>
+      <w:proofErr w:type="gramStart"/>
+      <w:r>
+        <w:rPr>
+          <w:sz w:val="24"/>
+          <w:szCs w:val="24"/>
+          <w:lang w:val="en-US"/>
+        </w:rPr>
+        <w:t xml:space="preserve">Kitchen  </w:t>
       </w:r>
       <w:r>
         <w:rPr>
@@ -1459,6 +1583,7 @@
         </w:rPr>
         <w:t>à</w:t>
       </w:r>
+      <w:proofErr w:type="gramEnd"/>
       <w:r>
         <w:rPr>
           <w:sz w:val="24"/>
@@ -1681,7 +1806,6 @@
           <w:sz w:val="24"/>
           <w:szCs w:val="24"/>
         </w:rPr>
-        <w:lastRenderedPageBreak/>
         <w:t xml:space="preserve">It would also be if you select a district, the bar graph color changes for the district you selected to highlight it better. </w:t>
       </w:r>
     </w:p>
@@ -1848,6 +1972,7 @@
           <w:sz w:val="24"/>
           <w:szCs w:val="24"/>
         </w:rPr>
+        <w:lastRenderedPageBreak/>
         <w:drawing>
           <wp:inline distT="0" distB="0" distL="0" distR="0" wp14:anchorId="062656AA" wp14:editId="441AE11A">
             <wp:extent cx="4633606" cy="2814320"/>
@@ -1932,121 +2057,121 @@
         <w:rPr>
           <w:lang w:val="en-US"/>
         </w:rPr>
+        <w:t xml:space="preserve">Also, Data documentation (currently an excel file) we would like to embed into the dashboard. </w:t>
+      </w:r>
+      <w:r>
+        <w:rPr>
+          <w:lang w:val="en-US"/>
+        </w:rPr>
+        <w:t>If people click on it, it should pull up the excel (see “About the data” bullet below). </w:t>
+      </w:r>
+      <w:r>
+        <w:rPr>
+          <w:lang w:val="en-US"/>
+        </w:rPr>
+        <w:t>And the ability to Download data used in the Dashboard</w:t>
+      </w:r>
+    </w:p>
+    <w:p>
+      <w:pPr>
+        <w:spacing w:line="360" w:lineRule="auto"/>
+        <w:rPr>
+          <w:sz w:val="24"/>
+          <w:szCs w:val="24"/>
+        </w:rPr>
+      </w:pPr>
+    </w:p>
+    <w:p>
+      <w:pPr>
+        <w:spacing w:line="360" w:lineRule="auto"/>
+        <w:rPr>
+          <w:sz w:val="24"/>
+          <w:szCs w:val="24"/>
+        </w:rPr>
+      </w:pPr>
+    </w:p>
+    <w:p>
+      <w:pPr>
+        <w:spacing w:line="360" w:lineRule="auto"/>
+        <w:rPr>
+          <w:sz w:val="24"/>
+          <w:szCs w:val="24"/>
+        </w:rPr>
+      </w:pPr>
+    </w:p>
+    <w:p>
+      <w:pPr>
+        <w:spacing w:line="360" w:lineRule="auto"/>
+        <w:rPr>
+          <w:sz w:val="24"/>
+          <w:szCs w:val="24"/>
+        </w:rPr>
+      </w:pPr>
+    </w:p>
+    <w:p>
+      <w:pPr>
+        <w:spacing w:line="360" w:lineRule="auto"/>
+        <w:rPr>
+          <w:b/>
+          <w:bCs/>
+          <w:sz w:val="24"/>
+          <w:szCs w:val="24"/>
+        </w:rPr>
+      </w:pPr>
+      <w:r>
+        <w:rPr>
+          <w:b/>
+          <w:bCs/>
+          <w:sz w:val="24"/>
+          <w:szCs w:val="24"/>
+        </w:rPr>
+        <w:t xml:space="preserve">Rough </w:t>
+      </w:r>
+      <w:r>
+        <w:rPr>
+          <w:b/>
+          <w:bCs/>
+          <w:sz w:val="24"/>
+          <w:szCs w:val="24"/>
+        </w:rPr>
+        <w:t xml:space="preserve">Main </w:t>
+      </w:r>
+      <w:r>
+        <w:rPr>
+          <w:b/>
+          <w:bCs/>
+          <w:sz w:val="24"/>
+          <w:szCs w:val="24"/>
+        </w:rPr>
+        <w:t>visualization</w:t>
+      </w:r>
+      <w:r>
+        <w:rPr>
+          <w:b/>
+          <w:bCs/>
+          <w:sz w:val="24"/>
+          <w:szCs w:val="24"/>
+        </w:rPr>
+        <w:t xml:space="preserve"> of Dashboard:</w:t>
+      </w:r>
+    </w:p>
+    <w:p>
+      <w:pPr>
+        <w:spacing w:line="360" w:lineRule="auto"/>
+        <w:rPr>
+          <w:sz w:val="24"/>
+          <w:szCs w:val="24"/>
+        </w:rPr>
+      </w:pPr>
+      <w:r>
+        <w:rPr>
+          <w:noProof/>
+          <w:sz w:val="24"/>
+          <w:szCs w:val="24"/>
+        </w:rPr>
         <w:lastRenderedPageBreak/>
-        <w:t xml:space="preserve">Also, Data documentation (currently an excel file) we would like to embed into the dashboard. </w:t>
-      </w:r>
-      <w:r>
-        <w:rPr>
-          <w:lang w:val="en-US"/>
-        </w:rPr>
-        <w:t>If people click on it, it should pull up the excel (see “About the data” bullet below). </w:t>
-      </w:r>
-      <w:r>
-        <w:rPr>
-          <w:lang w:val="en-US"/>
-        </w:rPr>
-        <w:t>And the ability to Download data used in the Dashboard</w:t>
-      </w:r>
-    </w:p>
-    <w:p>
-      <w:pPr>
-        <w:spacing w:line="360" w:lineRule="auto"/>
-        <w:rPr>
-          <w:sz w:val="24"/>
-          <w:szCs w:val="24"/>
-        </w:rPr>
-      </w:pPr>
-    </w:p>
-    <w:p>
-      <w:pPr>
-        <w:spacing w:line="360" w:lineRule="auto"/>
-        <w:rPr>
-          <w:sz w:val="24"/>
-          <w:szCs w:val="24"/>
-        </w:rPr>
-      </w:pPr>
-    </w:p>
-    <w:p>
-      <w:pPr>
-        <w:spacing w:line="360" w:lineRule="auto"/>
-        <w:rPr>
-          <w:sz w:val="24"/>
-          <w:szCs w:val="24"/>
-        </w:rPr>
-      </w:pPr>
-    </w:p>
-    <w:p>
-      <w:pPr>
-        <w:spacing w:line="360" w:lineRule="auto"/>
-        <w:rPr>
-          <w:sz w:val="24"/>
-          <w:szCs w:val="24"/>
-        </w:rPr>
-      </w:pPr>
-    </w:p>
-    <w:p>
-      <w:pPr>
-        <w:spacing w:line="360" w:lineRule="auto"/>
-        <w:rPr>
-          <w:b/>
-          <w:bCs/>
-          <w:sz w:val="24"/>
-          <w:szCs w:val="24"/>
-        </w:rPr>
-      </w:pPr>
-      <w:r>
-        <w:rPr>
-          <w:b/>
-          <w:bCs/>
-          <w:sz w:val="24"/>
-          <w:szCs w:val="24"/>
-        </w:rPr>
-        <w:t xml:space="preserve">Rough </w:t>
-      </w:r>
-      <w:r>
-        <w:rPr>
-          <w:b/>
-          <w:bCs/>
-          <w:sz w:val="24"/>
-          <w:szCs w:val="24"/>
-        </w:rPr>
-        <w:t xml:space="preserve">Main </w:t>
-      </w:r>
-      <w:r>
-        <w:rPr>
-          <w:b/>
-          <w:bCs/>
-          <w:sz w:val="24"/>
-          <w:szCs w:val="24"/>
-        </w:rPr>
-        <w:t>visualization</w:t>
-      </w:r>
-      <w:r>
-        <w:rPr>
-          <w:b/>
-          <w:bCs/>
-          <w:sz w:val="24"/>
-          <w:szCs w:val="24"/>
-        </w:rPr>
-        <w:t xml:space="preserve"> of Dashboard:</w:t>
-      </w:r>
-    </w:p>
-    <w:p>
-      <w:pPr>
-        <w:spacing w:line="360" w:lineRule="auto"/>
-        <w:rPr>
-          <w:sz w:val="24"/>
-          <w:szCs w:val="24"/>
-        </w:rPr>
-      </w:pPr>
-      <w:r>
-        <w:rPr>
-          <w:noProof/>
-          <w:sz w:val="24"/>
-          <w:szCs w:val="24"/>
-        </w:rPr>
         <w:drawing>
-          <wp:inline distT="0" distB="0" distL="0" distR="0" wp14:anchorId="10D99632" wp14:editId="5FEC5814">
+          <wp:inline distT="0" distB="0" distL="0" distR="0" wp14:anchorId="10D99632" wp14:editId="0515DEF8">
             <wp:extent cx="5989515" cy="4866481"/>
             <wp:effectExtent l="0" t="0" r="0" b="0"/>
             <wp:docPr id="1603832358" name="Picture 1"/>
@@ -2176,7 +2301,6 @@
           <w:szCs w:val="24"/>
           <w:lang w:val="en-US"/>
         </w:rPr>
-        <w:lastRenderedPageBreak/>
         <w:t xml:space="preserve">E.g. </w:t>
       </w:r>
       <w:r>
@@ -2275,6 +2399,7 @@
           <w:sz w:val="24"/>
           <w:szCs w:val="24"/>
         </w:rPr>
+        <w:lastRenderedPageBreak/>
         <w:t>Acknowledgements</w:t>
       </w:r>
       <w:r>
@@ -2407,7 +2532,23 @@
           <w:sz w:val="24"/>
           <w:szCs w:val="24"/>
         </w:rPr>
-        <w:t>This project received funding from the Transform Academia for Equity grant from Robert Wood Johnson Foundation</w:t>
+        <w:t xml:space="preserve">This project received funding from the Transform Academia for </w:t>
+      </w:r>
+      <w:proofErr w:type="gramStart"/>
+      <w:r>
+        <w:rPr>
+          <w:sz w:val="24"/>
+          <w:szCs w:val="24"/>
+        </w:rPr>
+        <w:t>Equity</w:t>
+      </w:r>
+      <w:proofErr w:type="gramEnd"/>
+      <w:r>
+        <w:rPr>
+          <w:sz w:val="24"/>
+          <w:szCs w:val="24"/>
+        </w:rPr>
+        <w:t xml:space="preserve"> grant from Robert Wood Johnson Foundation</w:t>
       </w:r>
     </w:p>
     <w:p>
@@ -2561,6 +2702,7 @@
           </w:rPr>
           <w:t>Schnake-Mahl A, Anfuso G, Goldstein ND, et al. Measuring variation in infant mortality and deaths of despair by US congressional district in Pennsylvania: a methodological case study. </w:t>
         </w:r>
+        <w:proofErr w:type="gramStart"/>
         <w:r>
           <w:rPr>
             <w:rStyle w:val="Hyperlink"/>
@@ -2571,7 +2713,20 @@
             <w:szCs w:val="20"/>
             <w:shd w:val="clear" w:color="auto" w:fill="FFFFFF"/>
           </w:rPr>
-          <w:t>Am J Epidemiol</w:t>
+          <w:t>Am</w:t>
+        </w:r>
+        <w:proofErr w:type="gramEnd"/>
+        <w:r>
+          <w:rPr>
+            <w:rStyle w:val="Hyperlink"/>
+            <w:rFonts w:ascii="Calibri" w:hAnsi="Calibri" w:cs="Calibri"/>
+            <w:i/>
+            <w:iCs/>
+            <w:sz w:val="20"/>
+            <w:szCs w:val="20"/>
+            <w:shd w:val="clear" w:color="auto" w:fill="FFFFFF"/>
+          </w:rPr>
+          <w:t xml:space="preserve"> J Epidemiol</w:t>
         </w:r>
         <w:r>
           <w:rPr>
@@ -2805,7 +2960,51 @@
             <w:szCs w:val="20"/>
             <w:shd w:val="clear" w:color="auto" w:fill="FFFFFF"/>
           </w:rPr>
-          <w:t>. 2023;24:101511. Published 2023 Sep 4. doi:10.1016/j.ssmph.2023.101511</w:t>
+          <w:t xml:space="preserve">. </w:t>
+        </w:r>
+        <w:proofErr w:type="gramStart"/>
+        <w:r>
+          <w:rPr>
+            <w:rStyle w:val="Hyperlink"/>
+            <w:rFonts w:ascii="Calibri" w:hAnsi="Calibri" w:cs="Calibri"/>
+            <w:sz w:val="20"/>
+            <w:szCs w:val="20"/>
+            <w:shd w:val="clear" w:color="auto" w:fill="FFFFFF"/>
+          </w:rPr>
+          <w:t>2023;24:101511</w:t>
+        </w:r>
+        <w:proofErr w:type="gramEnd"/>
+        <w:r>
+          <w:rPr>
+            <w:rStyle w:val="Hyperlink"/>
+            <w:rFonts w:ascii="Calibri" w:hAnsi="Calibri" w:cs="Calibri"/>
+            <w:sz w:val="20"/>
+            <w:szCs w:val="20"/>
+            <w:shd w:val="clear" w:color="auto" w:fill="FFFFFF"/>
+          </w:rPr>
+          <w:t xml:space="preserve">. Published 2023 Sep 4. </w:t>
+        </w:r>
+        <w:proofErr w:type="gramStart"/>
+        <w:r>
+          <w:rPr>
+            <w:rStyle w:val="Hyperlink"/>
+            <w:rFonts w:ascii="Calibri" w:hAnsi="Calibri" w:cs="Calibri"/>
+            <w:sz w:val="20"/>
+            <w:szCs w:val="20"/>
+            <w:shd w:val="clear" w:color="auto" w:fill="FFFFFF"/>
+          </w:rPr>
+          <w:t>doi:10.1016/j.ssmph</w:t>
+        </w:r>
+        <w:proofErr w:type="gramEnd"/>
+        <w:r>
+          <w:rPr>
+            <w:rStyle w:val="Hyperlink"/>
+            <w:rFonts w:ascii="Calibri" w:hAnsi="Calibri" w:cs="Calibri"/>
+            <w:sz w:val="20"/>
+            <w:szCs w:val="20"/>
+            <w:shd w:val="clear" w:color="auto" w:fill="FFFFFF"/>
+          </w:rPr>
+          <w:t>.2023.101511</w:t>
         </w:r>
       </w:hyperlink>
     </w:p>
@@ -3096,6 +3295,7 @@
           <w:szCs w:val="24"/>
           <w:lang w:val="en-US"/>
         </w:rPr>
+        <w:lastRenderedPageBreak/>
         <w:t>We identified a set of health determinants based on</w:t>
       </w:r>
       <w:r>

</xml_diff>

<commit_message>
Updated the PRD with changed from Will
</commit_message>
<xml_diff>
--- a/Data/Variables and PPT/PRD IDEA Fellowship.docx
+++ b/Data/Variables and PPT/PRD IDEA Fellowship.docx
@@ -337,7 +337,25 @@
           <w:szCs w:val="24"/>
           <w:lang w:val="en-US"/>
         </w:rPr>
-        <w:t>The health of Philadelphia residents varies drastically across the city – differences that reflect broader disparities in income, opportunity, and access to essential resources. These are not just personal choices made by the city’s residents – they are shaped by federal, state and local laws and policies.  </w:t>
+        <w:t xml:space="preserve">The health of Philadelphia residents varies drastically across the city – differences that reflect broader disparities in income, opportunity, and access to essential resources. </w:t>
+      </w:r>
+      <w:r>
+        <w:rPr>
+          <w:strike/>
+          <w:sz w:val="24"/>
+          <w:szCs w:val="24"/>
+          <w:highlight w:val="yellow"/>
+          <w:lang w:val="en-US"/>
+        </w:rPr>
+        <w:t>These are not just personal choices made by the city’s residents – they are shaped by federal, state and local laws and policies</w:t>
+      </w:r>
+      <w:r>
+        <w:rPr>
+          <w:sz w:val="24"/>
+          <w:szCs w:val="24"/>
+          <w:lang w:val="en-US"/>
+        </w:rPr>
+        <w:t>.  </w:t>
       </w:r>
     </w:p>
     <w:p>
@@ -373,7 +391,79 @@
           <w:szCs w:val="24"/>
           <w:lang w:val="en-US"/>
         </w:rPr>
-        <w:t>This project takes a closer look at those conditions by analyzing publicly available data and mapping key health indicators and social determinants of health across all 10 Philadelphia City Council Districts. By doing this, we aim to provide a clearer picture of how politics and geography intersect to shape the health of Philadelphians.  </w:t>
+        <w:t xml:space="preserve">This project takes a closer look at </w:t>
+      </w:r>
+      <w:proofErr w:type="spellStart"/>
+      <w:r>
+        <w:rPr>
+          <w:sz w:val="24"/>
+          <w:szCs w:val="24"/>
+          <w:lang w:val="en-US"/>
+        </w:rPr>
+        <w:t>th</w:t>
+      </w:r>
+      <w:r>
+        <w:rPr>
+          <w:strike/>
+          <w:sz w:val="24"/>
+          <w:szCs w:val="24"/>
+          <w:lang w:val="en-US"/>
+        </w:rPr>
+        <w:t>o</w:t>
+      </w:r>
+      <w:r>
+        <w:rPr>
+          <w:sz w:val="24"/>
+          <w:szCs w:val="24"/>
+          <w:highlight w:val="yellow"/>
+          <w:lang w:val="en-US"/>
+        </w:rPr>
+        <w:t>e</w:t>
+      </w:r>
+      <w:r>
+        <w:rPr>
+          <w:sz w:val="24"/>
+          <w:szCs w:val="24"/>
+          <w:lang w:val="en-US"/>
+        </w:rPr>
+        <w:t>se</w:t>
+      </w:r>
+      <w:proofErr w:type="spellEnd"/>
+      <w:r>
+        <w:rPr>
+          <w:sz w:val="24"/>
+          <w:szCs w:val="24"/>
+          <w:lang w:val="en-US"/>
+        </w:rPr>
+        <w:t xml:space="preserve"> conditions by analyzing publicly available data and mapping key health indicators and social determinants of health across all 10 Philadelphia City Council Districts. </w:t>
+      </w:r>
+      <w:proofErr w:type="spellStart"/>
+      <w:r>
+        <w:rPr>
+          <w:strike/>
+          <w:sz w:val="24"/>
+          <w:szCs w:val="24"/>
+          <w:lang w:val="en-US"/>
+        </w:rPr>
+        <w:t>By</w:t>
+      </w:r>
+      <w:r>
+        <w:rPr>
+          <w:sz w:val="24"/>
+          <w:szCs w:val="24"/>
+          <w:highlight w:val="yellow"/>
+          <w:lang w:val="en-US"/>
+        </w:rPr>
+        <w:t>In</w:t>
+      </w:r>
+      <w:proofErr w:type="spellEnd"/>
+      <w:r>
+        <w:rPr>
+          <w:sz w:val="24"/>
+          <w:szCs w:val="24"/>
+          <w:lang w:val="en-US"/>
+        </w:rPr>
+        <w:t xml:space="preserve"> doing this, we aim to provide a clearer picture of how politics and geography intersect to shape the health of Philadelphians.  </w:t>
       </w:r>
     </w:p>
     <w:p>
@@ -410,7 +500,91 @@
           <w:lang w:val="en-US"/>
         </w:rPr>
         <w:lastRenderedPageBreak/>
-        <w:t>Our goal is to equip all 17 Philadelphia City Council members and the public with actionable, district-level insights that can guide and empower more equitable policy and investment into our city. By connecting this data to City Council Districts, we hope this project continues to grow and support effective policy solutions that can promote equality and better health for all Philadelphians.  </w:t>
+        <w:t xml:space="preserve">Our goal is to equip all </w:t>
+      </w:r>
+      <w:r>
+        <w:rPr>
+          <w:strike/>
+          <w:sz w:val="24"/>
+          <w:szCs w:val="24"/>
+          <w:highlight w:val="yellow"/>
+          <w:lang w:val="en-US"/>
+        </w:rPr>
+        <w:t>17 Philadelphia City Council members</w:t>
+      </w:r>
+      <w:r>
+        <w:rPr>
+          <w:sz w:val="24"/>
+          <w:szCs w:val="24"/>
+          <w:lang w:val="en-US"/>
+        </w:rPr>
+        <w:t xml:space="preserve"> </w:t>
+      </w:r>
+      <w:r>
+        <w:rPr>
+          <w:color w:val="000000" w:themeColor="text1"/>
+          <w:sz w:val="24"/>
+          <w:szCs w:val="24"/>
+          <w:highlight w:val="yellow"/>
+          <w:lang w:val="en-US"/>
+        </w:rPr>
+        <w:t>l</w:t>
+      </w:r>
+      <w:proofErr w:type="spellStart"/>
+      <w:r>
+        <w:rPr>
+          <w:rStyle w:val="normaltextrun"/>
+          <w:rFonts w:ascii="Aptos" w:hAnsi="Aptos"/>
+          <w:color w:val="000000" w:themeColor="text1"/>
+          <w:highlight w:val="yellow"/>
+          <w:bdr w:val="none" w:sz="0" w:space="0" w:color="auto" w:frame="1"/>
+        </w:rPr>
+        <w:t>ocal</w:t>
+      </w:r>
+      <w:proofErr w:type="spellEnd"/>
+      <w:r>
+        <w:rPr>
+          <w:rStyle w:val="normaltextrun"/>
+          <w:rFonts w:ascii="Aptos" w:hAnsi="Aptos"/>
+          <w:color w:val="000000" w:themeColor="text1"/>
+          <w:highlight w:val="yellow"/>
+          <w:bdr w:val="none" w:sz="0" w:space="0" w:color="auto" w:frame="1"/>
+        </w:rPr>
+        <w:t xml:space="preserve"> officials, community leaders,</w:t>
+      </w:r>
+      <w:r>
+        <w:rPr>
+          <w:sz w:val="24"/>
+          <w:szCs w:val="24"/>
+          <w:lang w:val="en-US"/>
+        </w:rPr>
+        <w:t xml:space="preserve"> </w:t>
+      </w:r>
+      <w:r>
+        <w:rPr>
+          <w:sz w:val="24"/>
+          <w:szCs w:val="24"/>
+          <w:lang w:val="en-US"/>
+        </w:rPr>
+        <w:t xml:space="preserve">and the public with actionable, district-level insights that can guide and empower more equitable policy and investment into our city. By connecting this data to City Council Districts, we hope this project continues to grow and support effective </w:t>
+      </w:r>
+      <w:r>
+        <w:rPr>
+          <w:strike/>
+          <w:sz w:val="24"/>
+          <w:szCs w:val="24"/>
+          <w:highlight w:val="yellow"/>
+          <w:lang w:val="en-US"/>
+        </w:rPr>
+        <w:t>policy</w:t>
+      </w:r>
+      <w:r>
+        <w:rPr>
+          <w:sz w:val="24"/>
+          <w:szCs w:val="24"/>
+          <w:lang w:val="en-US"/>
+        </w:rPr>
+        <w:t xml:space="preserve"> solutions that can promote equality and better health for all Philadelphians.  </w:t>
       </w:r>
     </w:p>
     <w:p>
@@ -857,6 +1031,15 @@
         </w:rPr>
         <w:t>Black --&gt; Race and Ethnicity: Black</w:t>
       </w:r>
+      <w:r>
+        <w:rPr>
+          <w:sz w:val="24"/>
+          <w:szCs w:val="24"/>
+          <w:lang w:val="en-US"/>
+        </w:rPr>
+        <w:tab/>
+        <w:t>`</w:t>
+      </w:r>
     </w:p>
     <w:p>
       <w:pPr>
@@ -900,9 +1083,18 @@
         <w:rPr>
           <w:sz w:val="24"/>
           <w:szCs w:val="24"/>
-          <w:lang w:val="en-US"/>
-        </w:rPr>
-        <w:t xml:space="preserve">non-Hispanic </w:t>
+          <w:highlight w:val="yellow"/>
+          <w:lang w:val="en-US"/>
+        </w:rPr>
+        <w:t>N</w:t>
+      </w:r>
+      <w:r>
+        <w:rPr>
+          <w:sz w:val="24"/>
+          <w:szCs w:val="24"/>
+          <w:lang w:val="en-US"/>
+        </w:rPr>
+        <w:t xml:space="preserve">on-Hispanic </w:t>
       </w:r>
       <w:r>
         <w:rPr>
@@ -922,6 +1114,7 @@
         </w:numPr>
         <w:spacing w:line="360" w:lineRule="auto"/>
         <w:rPr>
+          <w:strike/>
           <w:sz w:val="24"/>
           <w:szCs w:val="24"/>
           <w:lang w:val="en-US"/>
@@ -945,11 +1138,59 @@
       </w:r>
       <w:r>
         <w:rPr>
+          <w:strike/>
           <w:sz w:val="24"/>
           <w:szCs w:val="24"/>
           <w:lang w:val="en-US"/>
         </w:rPr>
         <w:t>Native American</w:t>
+      </w:r>
+      <w:r>
+        <w:rPr>
+          <w:strike/>
+          <w:sz w:val="24"/>
+          <w:szCs w:val="24"/>
+          <w:lang w:val="en-US"/>
+        </w:rPr>
+        <w:t xml:space="preserve"> </w:t>
+      </w:r>
+      <w:proofErr w:type="spellStart"/>
+      <w:r>
+        <w:rPr>
+          <w:sz w:val="24"/>
+          <w:szCs w:val="24"/>
+          <w:highlight w:val="yellow"/>
+          <w:lang w:val="en-US"/>
+        </w:rPr>
+        <w:t>American</w:t>
+      </w:r>
+      <w:proofErr w:type="spellEnd"/>
+      <w:r>
+        <w:rPr>
+          <w:sz w:val="24"/>
+          <w:szCs w:val="24"/>
+          <w:highlight w:val="yellow"/>
+          <w:lang w:val="en-US"/>
+        </w:rPr>
+        <w:t xml:space="preserve"> Indian </w:t>
+      </w:r>
+      <w:r>
+        <w:rPr>
+          <w:sz w:val="24"/>
+          <w:szCs w:val="24"/>
+          <w:highlight w:val="yellow"/>
+          <w:lang w:val="en-US"/>
+        </w:rPr>
+        <w:t>and</w:t>
+      </w:r>
+      <w:r>
+        <w:rPr>
+          <w:sz w:val="24"/>
+          <w:szCs w:val="24"/>
+          <w:highlight w:val="yellow"/>
+          <w:lang w:val="en-US"/>
+        </w:rPr>
+        <w:t xml:space="preserve"> Alaskan Native</w:t>
       </w:r>
     </w:p>
     <w:p>
@@ -1003,7 +1244,25 @@
           <w:szCs w:val="24"/>
           <w:lang w:val="en-US"/>
         </w:rPr>
-        <w:t>Pacific Islander --&gt; Race and Ethnicity: Pacific Islander</w:t>
+        <w:t xml:space="preserve">Pacific Islander --&gt; Race and Ethnicity: </w:t>
+      </w:r>
+      <w:r>
+        <w:rPr>
+          <w:sz w:val="24"/>
+          <w:szCs w:val="24"/>
+          <w:highlight w:val="yellow"/>
+          <w:lang w:val="en-US"/>
+        </w:rPr>
+        <w:t xml:space="preserve">Native Hawaiian and </w:t>
+      </w:r>
+      <w:r>
+        <w:rPr>
+          <w:sz w:val="24"/>
+          <w:szCs w:val="24"/>
+          <w:highlight w:val="yellow"/>
+          <w:lang w:val="en-US"/>
+        </w:rPr>
+        <w:t>Pacific Islander</w:t>
       </w:r>
     </w:p>
     <w:p>
@@ -1017,13 +1276,24 @@
         <w:rPr>
           <w:sz w:val="24"/>
           <w:szCs w:val="24"/>
-          <w:lang w:val="en-US"/>
-        </w:rPr>
-      </w:pPr>
-      <w:r>
-        <w:rPr>
-          <w:sz w:val="24"/>
-          <w:szCs w:val="24"/>
+          <w:highlight w:val="yellow"/>
+          <w:lang w:val="en-US"/>
+        </w:rPr>
+      </w:pPr>
+      <w:r>
+        <w:rPr>
+          <w:sz w:val="24"/>
+          <w:szCs w:val="24"/>
+          <w:highlight w:val="yellow"/>
+          <w:lang w:val="en-US"/>
+        </w:rPr>
+        <w:t xml:space="preserve">REMOVE: </w:t>
+      </w:r>
+      <w:r>
+        <w:rPr>
+          <w:sz w:val="24"/>
+          <w:szCs w:val="24"/>
+          <w:highlight w:val="yellow"/>
           <w:lang w:val="en-US"/>
         </w:rPr>
         <w:t xml:space="preserve">Other Race --&gt; Race and Ethnicity: </w:t>
@@ -1032,6 +1302,7 @@
         <w:rPr>
           <w:sz w:val="24"/>
           <w:szCs w:val="24"/>
+          <w:highlight w:val="yellow"/>
           <w:lang w:val="en-US"/>
         </w:rPr>
         <w:t>Some other Race alone</w:t>
@@ -1065,7 +1336,15 @@
           <w:szCs w:val="24"/>
           <w:lang w:val="en-US"/>
         </w:rPr>
-        <w:t>Two or More Races</w:t>
+        <w:t xml:space="preserve">Two or More </w:t>
+      </w:r>
+      <w:r>
+        <w:rPr>
+          <w:sz w:val="24"/>
+          <w:szCs w:val="24"/>
+          <w:lang w:val="en-US"/>
+        </w:rPr>
+        <w:t>Races</w:t>
       </w:r>
     </w:p>
     <w:p>
@@ -1096,7 +1375,7 @@
           <w:szCs w:val="24"/>
           <w:lang w:val="en-US"/>
         </w:rPr>
-        <w:t xml:space="preserve"> --&gt; Race and Ethnicity: Hispanic Only</w:t>
+        <w:t xml:space="preserve"> --&gt; Race and Ethnicity: Hispanic </w:t>
       </w:r>
     </w:p>
     <w:p>
@@ -1327,6 +1606,15 @@
         </w:rPr>
         <w:t>chool</w:t>
       </w:r>
+      <w:r>
+        <w:rPr>
+          <w:sz w:val="24"/>
+          <w:szCs w:val="24"/>
+          <w:highlight w:val="yellow"/>
+          <w:lang w:val="en-US"/>
+        </w:rPr>
+        <w:t xml:space="preserve"> Education</w:t>
+      </w:r>
     </w:p>
     <w:p>
       <w:pPr>
@@ -1362,16 +1650,27 @@
         <w:rPr>
           <w:sz w:val="24"/>
           <w:szCs w:val="24"/>
-          <w:lang w:val="en-US"/>
-        </w:rPr>
-      </w:pPr>
-      <w:r>
-        <w:rPr>
-          <w:sz w:val="24"/>
-          <w:szCs w:val="24"/>
+          <w:highlight w:val="yellow"/>
+          <w:lang w:val="en-US"/>
+        </w:rPr>
+      </w:pPr>
+      <w:r>
+        <w:rPr>
+          <w:sz w:val="24"/>
+          <w:szCs w:val="24"/>
+          <w:highlight w:val="yellow"/>
           <w:lang w:val="en-US"/>
         </w:rPr>
         <w:t>Some College --&gt; Education: Some College</w:t>
+      </w:r>
+      <w:r>
+        <w:rPr>
+          <w:sz w:val="24"/>
+          <w:szCs w:val="24"/>
+          <w:highlight w:val="yellow"/>
+          <w:lang w:val="en-US"/>
+        </w:rPr>
+        <w:t xml:space="preserve"> Education</w:t>
       </w:r>
     </w:p>
     <w:p>
@@ -1467,6 +1766,7 @@
           <w:szCs w:val="24"/>
           <w:lang w:val="en-US"/>
         </w:rPr>
+        <w:lastRenderedPageBreak/>
         <w:t>The spatial map should have the district number displayed.</w:t>
       </w:r>
       <w:r>
@@ -1562,17 +1862,7 @@
           <w:szCs w:val="24"/>
           <w:lang w:val="en-US"/>
         </w:rPr>
-        <w:lastRenderedPageBreak/>
-        <w:t xml:space="preserve">Lack of Complete </w:t>
-      </w:r>
-      <w:proofErr w:type="gramStart"/>
-      <w:r>
-        <w:rPr>
-          <w:sz w:val="24"/>
-          <w:szCs w:val="24"/>
-          <w:lang w:val="en-US"/>
-        </w:rPr>
-        <w:t xml:space="preserve">Kitchen  </w:t>
+        <w:t xml:space="preserve">Lack of Complete Kitchen  </w:t>
       </w:r>
       <w:r>
         <w:rPr>
@@ -1583,7 +1873,6 @@
         </w:rPr>
         <w:t>à</w:t>
       </w:r>
-      <w:proofErr w:type="gramEnd"/>
       <w:r>
         <w:rPr>
           <w:sz w:val="24"/>
@@ -1927,7 +2216,16 @@
           <w:szCs w:val="24"/>
           <w:lang w:val="en-US"/>
         </w:rPr>
-        <w:t>, rather than a bar graph,</w:t>
+        <w:t xml:space="preserve">, </w:t>
+      </w:r>
+      <w:r>
+        <w:rPr>
+          <w:sz w:val="24"/>
+          <w:szCs w:val="24"/>
+          <w:lang w:val="en-US"/>
+        </w:rPr>
+        <w:lastRenderedPageBreak/>
+        <w:t>rather than a bar graph,</w:t>
       </w:r>
       <w:r>
         <w:rPr>
@@ -1972,7 +2270,6 @@
           <w:sz w:val="24"/>
           <w:szCs w:val="24"/>
         </w:rPr>
-        <w:lastRenderedPageBreak/>
         <w:drawing>
           <wp:inline distT="0" distB="0" distL="0" distR="0" wp14:anchorId="062656AA" wp14:editId="441AE11A">
             <wp:extent cx="4633606" cy="2814320"/>
@@ -2171,7 +2468,7 @@
         </w:rPr>
         <w:lastRenderedPageBreak/>
         <w:drawing>
-          <wp:inline distT="0" distB="0" distL="0" distR="0" wp14:anchorId="10D99632" wp14:editId="0515DEF8">
+          <wp:inline distT="0" distB="0" distL="0" distR="0" wp14:anchorId="10D99632" wp14:editId="30523E05">
             <wp:extent cx="5989515" cy="4866481"/>
             <wp:effectExtent l="0" t="0" r="0" b="0"/>
             <wp:docPr id="1603832358" name="Picture 1"/>
@@ -2532,23 +2829,7 @@
           <w:sz w:val="24"/>
           <w:szCs w:val="24"/>
         </w:rPr>
-        <w:t xml:space="preserve">This project received funding from the Transform Academia for </w:t>
-      </w:r>
-      <w:proofErr w:type="gramStart"/>
-      <w:r>
-        <w:rPr>
-          <w:sz w:val="24"/>
-          <w:szCs w:val="24"/>
-        </w:rPr>
-        <w:t>Equity</w:t>
-      </w:r>
-      <w:proofErr w:type="gramEnd"/>
-      <w:r>
-        <w:rPr>
-          <w:sz w:val="24"/>
-          <w:szCs w:val="24"/>
-        </w:rPr>
-        <w:t xml:space="preserve"> grant from Robert Wood Johnson Foundation</w:t>
+        <w:t>This project received funding from the Transform Academia for Equity grant from Robert Wood Johnson Foundation</w:t>
       </w:r>
     </w:p>
     <w:p>
@@ -2702,7 +2983,6 @@
           </w:rPr>
           <w:t>Schnake-Mahl A, Anfuso G, Goldstein ND, et al. Measuring variation in infant mortality and deaths of despair by US congressional district in Pennsylvania: a methodological case study. </w:t>
         </w:r>
-        <w:proofErr w:type="gramStart"/>
         <w:r>
           <w:rPr>
             <w:rStyle w:val="Hyperlink"/>
@@ -2713,20 +2993,7 @@
             <w:szCs w:val="20"/>
             <w:shd w:val="clear" w:color="auto" w:fill="FFFFFF"/>
           </w:rPr>
-          <w:t>Am</w:t>
-        </w:r>
-        <w:proofErr w:type="gramEnd"/>
-        <w:r>
-          <w:rPr>
-            <w:rStyle w:val="Hyperlink"/>
-            <w:rFonts w:ascii="Calibri" w:hAnsi="Calibri" w:cs="Calibri"/>
-            <w:i/>
-            <w:iCs/>
-            <w:sz w:val="20"/>
-            <w:szCs w:val="20"/>
-            <w:shd w:val="clear" w:color="auto" w:fill="FFFFFF"/>
-          </w:rPr>
-          <w:t xml:space="preserve"> J Epidemiol</w:t>
+          <w:t>Am J Epidemiol</w:t>
         </w:r>
         <w:r>
           <w:rPr>
@@ -2960,51 +3227,7 @@
             <w:szCs w:val="20"/>
             <w:shd w:val="clear" w:color="auto" w:fill="FFFFFF"/>
           </w:rPr>
-          <w:t xml:space="preserve">. </w:t>
-        </w:r>
-        <w:proofErr w:type="gramStart"/>
-        <w:r>
-          <w:rPr>
-            <w:rStyle w:val="Hyperlink"/>
-            <w:rFonts w:ascii="Calibri" w:hAnsi="Calibri" w:cs="Calibri"/>
-            <w:sz w:val="20"/>
-            <w:szCs w:val="20"/>
-            <w:shd w:val="clear" w:color="auto" w:fill="FFFFFF"/>
-          </w:rPr>
-          <w:t>2023;24:101511</w:t>
-        </w:r>
-        <w:proofErr w:type="gramEnd"/>
-        <w:r>
-          <w:rPr>
-            <w:rStyle w:val="Hyperlink"/>
-            <w:rFonts w:ascii="Calibri" w:hAnsi="Calibri" w:cs="Calibri"/>
-            <w:sz w:val="20"/>
-            <w:szCs w:val="20"/>
-            <w:shd w:val="clear" w:color="auto" w:fill="FFFFFF"/>
-          </w:rPr>
-          <w:t xml:space="preserve">. Published 2023 Sep 4. </w:t>
-        </w:r>
-        <w:proofErr w:type="gramStart"/>
-        <w:r>
-          <w:rPr>
-            <w:rStyle w:val="Hyperlink"/>
-            <w:rFonts w:ascii="Calibri" w:hAnsi="Calibri" w:cs="Calibri"/>
-            <w:sz w:val="20"/>
-            <w:szCs w:val="20"/>
-            <w:shd w:val="clear" w:color="auto" w:fill="FFFFFF"/>
-          </w:rPr>
-          <w:t>doi:10.1016/j.ssmph</w:t>
-        </w:r>
-        <w:proofErr w:type="gramEnd"/>
-        <w:r>
-          <w:rPr>
-            <w:rStyle w:val="Hyperlink"/>
-            <w:rFonts w:ascii="Calibri" w:hAnsi="Calibri" w:cs="Calibri"/>
-            <w:sz w:val="20"/>
-            <w:szCs w:val="20"/>
-            <w:shd w:val="clear" w:color="auto" w:fill="FFFFFF"/>
-          </w:rPr>
-          <w:t>.2023.101511</w:t>
+          <w:t>. 2023;24:101511. Published 2023 Sep 4. doi:10.1016/j.ssmph.2023.101511</w:t>
         </w:r>
       </w:hyperlink>
     </w:p>
@@ -5111,6 +5334,11 @@
       <w:shd w:val="clear" w:color="auto" w:fill="E1DFDD"/>
     </w:rPr>
   </w:style>
+  <w:style w:type="character" w:customStyle="1" w:styleId="normaltextrun">
+    <w:name w:val="normaltextrun"/>
+    <w:basedOn w:val="DefaultParagraphFont"/>
+    <w:rsid w:val="00FE13CA"/>
+  </w:style>
 </w:styles>
 </file>
 

</xml_diff>

<commit_message>
updated the PRD and excel doc with edits that need to be made by @ran-codes
</commit_message>
<xml_diff>
--- a/Data/Variables and PPT/PRD IDEA Fellowship.docx
+++ b/Data/Variables and PPT/PRD IDEA Fellowship.docx
@@ -635,6 +635,392 @@
       <w:pPr>
         <w:spacing w:line="360" w:lineRule="auto"/>
         <w:rPr>
+          <w:sz w:val="24"/>
+          <w:szCs w:val="24"/>
+        </w:rPr>
+      </w:pPr>
+    </w:p>
+    <w:p>
+      <w:pPr>
+        <w:spacing w:line="360" w:lineRule="auto"/>
+        <w:rPr>
+          <w:sz w:val="24"/>
+          <w:szCs w:val="24"/>
+        </w:rPr>
+      </w:pPr>
+      <w:r>
+        <w:rPr>
+          <w:b/>
+          <w:bCs/>
+          <w:sz w:val="24"/>
+          <w:szCs w:val="24"/>
+          <w:highlight w:val="yellow"/>
+        </w:rPr>
+        <w:t xml:space="preserve">Learn </w:t>
+      </w:r>
+      <w:r>
+        <w:rPr>
+          <w:b/>
+          <w:bCs/>
+          <w:sz w:val="24"/>
+          <w:szCs w:val="24"/>
+          <w:highlight w:val="yellow"/>
+        </w:rPr>
+        <w:t>a</w:t>
+      </w:r>
+      <w:r>
+        <w:rPr>
+          <w:b/>
+          <w:bCs/>
+          <w:sz w:val="24"/>
+          <w:szCs w:val="24"/>
+          <w:highlight w:val="yellow"/>
+        </w:rPr>
+        <w:t>bout</w:t>
+      </w:r>
+      <w:r>
+        <w:rPr>
+          <w:b/>
+          <w:bCs/>
+          <w:sz w:val="24"/>
+          <w:szCs w:val="24"/>
+          <w:highlight w:val="yellow"/>
+        </w:rPr>
+        <w:t xml:space="preserve"> </w:t>
+      </w:r>
+      <w:r>
+        <w:rPr>
+          <w:b/>
+          <w:bCs/>
+          <w:sz w:val="24"/>
+          <w:szCs w:val="24"/>
+          <w:highlight w:val="yellow"/>
+        </w:rPr>
+        <w:t>P</w:t>
+      </w:r>
+      <w:r>
+        <w:rPr>
+          <w:b/>
+          <w:bCs/>
+          <w:sz w:val="24"/>
+          <w:szCs w:val="24"/>
+          <w:highlight w:val="yellow"/>
+        </w:rPr>
+        <w:t>hiladelphia</w:t>
+      </w:r>
+      <w:r>
+        <w:rPr>
+          <w:b/>
+          <w:bCs/>
+          <w:sz w:val="24"/>
+          <w:szCs w:val="24"/>
+          <w:highlight w:val="yellow"/>
+        </w:rPr>
+        <w:t xml:space="preserve">’s city </w:t>
+      </w:r>
+      <w:r>
+        <w:rPr>
+          <w:b/>
+          <w:bCs/>
+          <w:sz w:val="24"/>
+          <w:szCs w:val="24"/>
+          <w:highlight w:val="yellow"/>
+        </w:rPr>
+        <w:t>g</w:t>
+      </w:r>
+      <w:r>
+        <w:rPr>
+          <w:b/>
+          <w:bCs/>
+          <w:sz w:val="24"/>
+          <w:szCs w:val="24"/>
+          <w:highlight w:val="yellow"/>
+        </w:rPr>
+        <w:t xml:space="preserve">overnment </w:t>
+      </w:r>
+      <w:r>
+        <w:rPr>
+          <w:b/>
+          <w:bCs/>
+          <w:sz w:val="24"/>
+          <w:szCs w:val="24"/>
+          <w:highlight w:val="yellow"/>
+        </w:rPr>
+        <w:t>w</w:t>
+      </w:r>
+      <w:r>
+        <w:rPr>
+          <w:b/>
+          <w:bCs/>
+          <w:sz w:val="24"/>
+          <w:szCs w:val="24"/>
+          <w:highlight w:val="yellow"/>
+        </w:rPr>
+        <w:t>orks</w:t>
+      </w:r>
+      <w:r>
+        <w:rPr>
+          <w:sz w:val="24"/>
+          <w:szCs w:val="24"/>
+          <w:highlight w:val="yellow"/>
+        </w:rPr>
+        <w:t xml:space="preserve">: </w:t>
+      </w:r>
+      <w:r>
+        <w:rPr>
+          <w:i/>
+          <w:iCs/>
+          <w:sz w:val="24"/>
+          <w:szCs w:val="24"/>
+          <w:highlight w:val="yellow"/>
+        </w:rPr>
+        <w:t>hyperlink the words:</w:t>
+      </w:r>
+      <w:r>
+        <w:rPr>
+          <w:sz w:val="24"/>
+          <w:szCs w:val="24"/>
+          <w:highlight w:val="yellow"/>
+        </w:rPr>
+        <w:t xml:space="preserve"> “How Philly Works: A Guide to Our City Government, </w:t>
+      </w:r>
+      <w:r>
+        <w:rPr>
+          <w:sz w:val="24"/>
+          <w:szCs w:val="24"/>
+          <w:highlight w:val="yellow"/>
+        </w:rPr>
+        <w:t xml:space="preserve">Committee </w:t>
+      </w:r>
+      <w:r>
+        <w:rPr>
+          <w:i/>
+          <w:iCs/>
+          <w:sz w:val="24"/>
+          <w:szCs w:val="24"/>
+          <w:highlight w:val="yellow"/>
+        </w:rPr>
+        <w:t>of</w:t>
+      </w:r>
+      <w:r>
+        <w:rPr>
+          <w:sz w:val="24"/>
+          <w:szCs w:val="24"/>
+          <w:highlight w:val="yellow"/>
+        </w:rPr>
+        <w:t xml:space="preserve"> Seventy</w:t>
+      </w:r>
+      <w:r>
+        <w:rPr>
+          <w:sz w:val="24"/>
+          <w:szCs w:val="24"/>
+          <w:highlight w:val="yellow"/>
+        </w:rPr>
+        <w:t xml:space="preserve">” </w:t>
+      </w:r>
+      <w:r>
+        <w:rPr>
+          <w:i/>
+          <w:iCs/>
+          <w:sz w:val="24"/>
+          <w:szCs w:val="24"/>
+          <w:highlight w:val="yellow"/>
+        </w:rPr>
+        <w:t>with this link</w:t>
+      </w:r>
+      <w:r>
+        <w:rPr>
+          <w:sz w:val="24"/>
+          <w:szCs w:val="24"/>
+          <w:highlight w:val="yellow"/>
+        </w:rPr>
+        <w:t>:</w:t>
+      </w:r>
+      <w:r>
+        <w:rPr>
+          <w:rFonts w:ascii="Segoe UI" w:hAnsi="Segoe UI" w:cs="Segoe UI"/>
+          <w:sz w:val="21"/>
+          <w:szCs w:val="21"/>
+          <w:highlight w:val="yellow"/>
+        </w:rPr>
+        <w:t xml:space="preserve"> </w:t>
+      </w:r>
+      <w:hyperlink r:id="rId9" w:tgtFrame="_blank" w:tooltip="https://seventy.org/uploads/attachments/clmt8ss9401fk4wnpfzbicd6q-how-philly-works-101.pdf" w:history="1">
+        <w:r>
+          <w:rPr>
+            <w:rStyle w:val="Hyperlink"/>
+            <w:rFonts w:ascii="Segoe UI" w:hAnsi="Segoe UI" w:cs="Segoe UI"/>
+            <w:sz w:val="21"/>
+            <w:szCs w:val="21"/>
+            <w:highlight w:val="yellow"/>
+          </w:rPr>
+          <w:t>https://seventy.org/upl</w:t>
+        </w:r>
+        <w:r>
+          <w:rPr>
+            <w:rStyle w:val="Hyperlink"/>
+            <w:rFonts w:ascii="Segoe UI" w:hAnsi="Segoe UI" w:cs="Segoe UI"/>
+            <w:sz w:val="21"/>
+            <w:szCs w:val="21"/>
+            <w:highlight w:val="yellow"/>
+          </w:rPr>
+          <w:t>o</w:t>
+        </w:r>
+        <w:r>
+          <w:rPr>
+            <w:rStyle w:val="Hyperlink"/>
+            <w:rFonts w:ascii="Segoe UI" w:hAnsi="Segoe UI" w:cs="Segoe UI"/>
+            <w:sz w:val="21"/>
+            <w:szCs w:val="21"/>
+            <w:highlight w:val="yellow"/>
+          </w:rPr>
+          <w:t>ads/attachments/clmt8ss9401fk4wnpfzbicd6q-how-philly-works-101.pdf</w:t>
+        </w:r>
+      </w:hyperlink>
+      <w:r>
+        <w:rPr>
+          <w:rFonts w:ascii="Segoe UI" w:hAnsi="Segoe UI" w:cs="Segoe UI"/>
+          <w:sz w:val="21"/>
+          <w:szCs w:val="21"/>
+          <w:highlight w:val="yellow"/>
+        </w:rPr>
+        <w:t xml:space="preserve"> and </w:t>
+      </w:r>
+      <w:r>
+        <w:rPr>
+          <w:rFonts w:ascii="Segoe UI" w:hAnsi="Segoe UI" w:cs="Segoe UI"/>
+          <w:i/>
+          <w:iCs/>
+          <w:sz w:val="21"/>
+          <w:szCs w:val="21"/>
+          <w:highlight w:val="yellow"/>
+        </w:rPr>
+        <w:t>then the word</w:t>
+      </w:r>
+      <w:r>
+        <w:rPr>
+          <w:rFonts w:ascii="Segoe UI" w:hAnsi="Segoe UI" w:cs="Segoe UI"/>
+          <w:sz w:val="21"/>
+          <w:szCs w:val="21"/>
+          <w:highlight w:val="yellow"/>
+        </w:rPr>
+        <w:t xml:space="preserve">: “in Spanish” </w:t>
+      </w:r>
+      <w:r>
+        <w:rPr>
+          <w:rFonts w:ascii="Segoe UI" w:hAnsi="Segoe UI" w:cs="Segoe UI"/>
+          <w:i/>
+          <w:iCs/>
+          <w:sz w:val="21"/>
+          <w:szCs w:val="21"/>
+          <w:highlight w:val="yellow"/>
+        </w:rPr>
+        <w:t>with</w:t>
+      </w:r>
+      <w:r>
+        <w:rPr>
+          <w:rFonts w:ascii="Segoe UI" w:hAnsi="Segoe UI" w:cs="Segoe UI"/>
+          <w:sz w:val="21"/>
+          <w:szCs w:val="21"/>
+          <w:highlight w:val="yellow"/>
+        </w:rPr>
+        <w:t xml:space="preserve">: </w:t>
+      </w:r>
+      <w:hyperlink r:id="rId10" w:tgtFrame="_blank" w:tooltip="https://seventy.org/uploads/attachments/cmcaph7j81os066npn3ufnt1c-how-philly-works-101-spanish-final.pdf" w:history="1">
+        <w:r>
+          <w:rPr>
+            <w:rStyle w:val="Hyperlink"/>
+            <w:rFonts w:ascii="Segoe UI" w:hAnsi="Segoe UI" w:cs="Segoe UI"/>
+            <w:sz w:val="21"/>
+            <w:szCs w:val="21"/>
+            <w:highlight w:val="yellow"/>
+          </w:rPr>
+          <w:t>https://seventy.org/uploads/attachments/cmcaph7j81os066npn3ufnt1c-how-philly-works-101-spanish-final.pdf</w:t>
+        </w:r>
+      </w:hyperlink>
+      <w:r>
+        <w:rPr>
+          <w:rFonts w:ascii="Segoe UI" w:hAnsi="Segoe UI" w:cs="Segoe UI"/>
+          <w:sz w:val="21"/>
+          <w:szCs w:val="21"/>
+          <w:highlight w:val="yellow"/>
+        </w:rPr>
+        <w:t xml:space="preserve"> </w:t>
+      </w:r>
+      <w:r>
+        <w:rPr>
+          <w:rFonts w:ascii="Segoe UI" w:hAnsi="Segoe UI" w:cs="Segoe UI"/>
+          <w:i/>
+          <w:iCs/>
+          <w:sz w:val="21"/>
+          <w:szCs w:val="21"/>
+          <w:highlight w:val="yellow"/>
+        </w:rPr>
+        <w:t>and</w:t>
+      </w:r>
+      <w:r>
+        <w:rPr>
+          <w:rFonts w:ascii="Segoe UI" w:hAnsi="Segoe UI" w:cs="Segoe UI"/>
+          <w:sz w:val="21"/>
+          <w:szCs w:val="21"/>
+          <w:highlight w:val="yellow"/>
+        </w:rPr>
+        <w:t xml:space="preserve"> “in Chinese” </w:t>
+      </w:r>
+      <w:r>
+        <w:rPr>
+          <w:rFonts w:ascii="Segoe UI" w:hAnsi="Segoe UI" w:cs="Segoe UI"/>
+          <w:i/>
+          <w:iCs/>
+          <w:sz w:val="21"/>
+          <w:szCs w:val="21"/>
+          <w:highlight w:val="yellow"/>
+        </w:rPr>
+        <w:t>with</w:t>
+      </w:r>
+      <w:r>
+        <w:rPr>
+          <w:rFonts w:ascii="Segoe UI" w:hAnsi="Segoe UI" w:cs="Segoe UI"/>
+          <w:sz w:val="21"/>
+          <w:szCs w:val="21"/>
+          <w:highlight w:val="yellow"/>
+        </w:rPr>
+        <w:t xml:space="preserve"> </w:t>
+      </w:r>
+      <w:hyperlink r:id="rId11" w:tgtFrame="_blank" w:tooltip="https://seventy.org/uploads/attachments/cmcapsx5a1orr5fnpsx4g4oly-final-hpw-guide-zhs.pdf" w:history="1">
+        <w:r>
+          <w:rPr>
+            <w:rStyle w:val="Hyperlink"/>
+            <w:rFonts w:ascii="Segoe UI" w:hAnsi="Segoe UI" w:cs="Segoe UI"/>
+            <w:sz w:val="21"/>
+            <w:szCs w:val="21"/>
+            <w:highlight w:val="yellow"/>
+          </w:rPr>
+          <w:t>https://seventy.org/uploads/attachments/cmcapsx5a1orr5fnpsx4g4oly-final-hpw-guide-zhs.pdf</w:t>
+        </w:r>
+      </w:hyperlink>
+    </w:p>
+    <w:p>
+      <w:pPr>
+        <w:spacing w:line="360" w:lineRule="auto"/>
+        <w:rPr>
+          <w:sz w:val="24"/>
+          <w:szCs w:val="24"/>
+        </w:rPr>
+      </w:pPr>
+      <w:r>
+        <w:rPr>
+          <w:rFonts w:ascii="Segoe UI" w:hAnsi="Segoe UI" w:cs="Segoe UI"/>
+          <w:sz w:val="21"/>
+          <w:szCs w:val="21"/>
+        </w:rPr>
+        <w:t> </w:t>
+      </w:r>
+    </w:p>
+    <w:p>
+      <w:pPr>
+        <w:spacing w:line="360" w:lineRule="auto"/>
+        <w:rPr>
           <w:b/>
           <w:bCs/>
           <w:sz w:val="24"/>
@@ -847,6 +1233,7 @@
           <w:sz w:val="24"/>
           <w:szCs w:val="24"/>
         </w:rPr>
+        <w:lastRenderedPageBreak/>
         <w:t xml:space="preserve">Rename “Uninsured” to “Without Health Insurance” </w:t>
       </w:r>
       <w:r>
@@ -982,7 +1369,6 @@
           <w:szCs w:val="24"/>
           <w:highlight w:val="yellow"/>
         </w:rPr>
-        <w:lastRenderedPageBreak/>
         <w:t xml:space="preserve">Rename “Lack Complete Plumbing” to “Housing Quality: Lacking Complete Plumbing Facilities” </w:t>
       </w:r>
     </w:p>
@@ -1276,19 +1662,9 @@
         <w:rPr>
           <w:sz w:val="24"/>
           <w:szCs w:val="24"/>
-          <w:highlight w:val="yellow"/>
-          <w:lang w:val="en-US"/>
-        </w:rPr>
-      </w:pPr>
-      <w:r>
-        <w:rPr>
-          <w:sz w:val="24"/>
-          <w:szCs w:val="24"/>
-          <w:highlight w:val="yellow"/>
-          <w:lang w:val="en-US"/>
-        </w:rPr>
-        <w:t xml:space="preserve">REMOVE: </w:t>
-      </w:r>
+          <w:lang w:val="en-US"/>
+        </w:rPr>
+      </w:pPr>
       <w:r>
         <w:rPr>
           <w:sz w:val="24"/>
@@ -1305,7 +1681,59 @@
           <w:highlight w:val="yellow"/>
           <w:lang w:val="en-US"/>
         </w:rPr>
-        <w:t>Some other Race alone</w:t>
+        <w:t>Other</w:t>
+      </w:r>
+      <w:r>
+        <w:rPr>
+          <w:sz w:val="24"/>
+          <w:szCs w:val="24"/>
+          <w:highlight w:val="yellow"/>
+          <w:lang w:val="en-US"/>
+        </w:rPr>
+        <w:t xml:space="preserve"> Race (</w:t>
+      </w:r>
+      <w:r>
+        <w:rPr>
+          <w:sz w:val="24"/>
+          <w:szCs w:val="24"/>
+          <w:highlight w:val="yellow"/>
+          <w:lang w:val="en-US"/>
+        </w:rPr>
+        <w:t>N</w:t>
+      </w:r>
+      <w:r>
+        <w:rPr>
+          <w:sz w:val="24"/>
+          <w:szCs w:val="24"/>
+          <w:highlight w:val="yellow"/>
+          <w:lang w:val="en-US"/>
+        </w:rPr>
+        <w:t xml:space="preserve">ot </w:t>
+      </w:r>
+      <w:r>
+        <w:rPr>
+          <w:sz w:val="24"/>
+          <w:szCs w:val="24"/>
+          <w:highlight w:val="yellow"/>
+          <w:lang w:val="en-US"/>
+        </w:rPr>
+        <w:t>L</w:t>
+      </w:r>
+      <w:r>
+        <w:rPr>
+          <w:sz w:val="24"/>
+          <w:szCs w:val="24"/>
+          <w:highlight w:val="yellow"/>
+          <w:lang w:val="en-US"/>
+        </w:rPr>
+        <w:t>isted).</w:t>
+      </w:r>
+      <w:r>
+        <w:rPr>
+          <w:rFonts w:ascii="Aptos" w:hAnsi="Aptos"/>
+          <w:color w:val="212121"/>
+        </w:rPr>
+        <w:t xml:space="preserve"> </w:t>
       </w:r>
     </w:p>
     <w:p>
@@ -1689,6 +2117,7 @@
         <w:rPr>
           <w:lang w:val="en-US"/>
         </w:rPr>
+        <w:lastRenderedPageBreak/>
         <w:t>College Graduate --&gt; Education: College Graduate</w:t>
       </w:r>
     </w:p>
@@ -1766,7 +2195,6 @@
           <w:szCs w:val="24"/>
           <w:lang w:val="en-US"/>
         </w:rPr>
-        <w:lastRenderedPageBreak/>
         <w:t>The spatial map should have the district number displayed.</w:t>
       </w:r>
       <w:r>
@@ -2152,6 +2580,7 @@
           <w:szCs w:val="24"/>
           <w:lang w:val="en-US"/>
         </w:rPr>
+        <w:lastRenderedPageBreak/>
         <w:t xml:space="preserve">Also, an explanation as to what the Heat Vulnerability Index is measuring could take the place of the bar graph </w:t>
       </w:r>
       <w:r>
@@ -2216,16 +2645,7 @@
           <w:szCs w:val="24"/>
           <w:lang w:val="en-US"/>
         </w:rPr>
-        <w:t xml:space="preserve">, </w:t>
-      </w:r>
-      <w:r>
-        <w:rPr>
-          <w:sz w:val="24"/>
-          <w:szCs w:val="24"/>
-          <w:lang w:val="en-US"/>
-        </w:rPr>
-        <w:lastRenderedPageBreak/>
-        <w:t>rather than a bar graph,</w:t>
+        <w:t>, rather than a bar graph,</w:t>
       </w:r>
       <w:r>
         <w:rPr>
@@ -2286,7 +2706,7 @@
                     <pic:cNvPicPr/>
                   </pic:nvPicPr>
                   <pic:blipFill>
-                    <a:blip r:embed="rId9">
+                    <a:blip r:embed="rId12">
                       <a:extLst>
                         <a:ext uri="{28A0092B-C50C-407E-A947-70E740481C1C}">
                           <a14:useLocalDpi xmlns:a14="http://schemas.microsoft.com/office/drawing/2010/main" val="0"/>
@@ -2468,7 +2888,7 @@
         </w:rPr>
         <w:lastRenderedPageBreak/>
         <w:drawing>
-          <wp:inline distT="0" distB="0" distL="0" distR="0" wp14:anchorId="10D99632" wp14:editId="30523E05">
+          <wp:inline distT="0" distB="0" distL="0" distR="0" wp14:anchorId="10D99632" wp14:editId="4D77F7F2">
             <wp:extent cx="5989515" cy="4866481"/>
             <wp:effectExtent l="0" t="0" r="0" b="0"/>
             <wp:docPr id="1603832358" name="Picture 1"/>
@@ -2483,7 +2903,7 @@
                     <pic:cNvPicPr/>
                   </pic:nvPicPr>
                   <pic:blipFill>
-                    <a:blip r:embed="rId10" cstate="print">
+                    <a:blip r:embed="rId13" cstate="print">
                       <a:extLst>
                         <a:ext uri="{28A0092B-C50C-407E-A947-70E740481C1C}">
                           <a14:useLocalDpi xmlns:a14="http://schemas.microsoft.com/office/drawing/2010/main" val="0"/>
@@ -2622,7 +3042,7 @@
                     </pic:cNvPicPr>
                   </pic:nvPicPr>
                   <pic:blipFill>
-                    <a:blip r:embed="rId11">
+                    <a:blip r:embed="rId14">
                       <a:extLst>
                         <a:ext uri="{28A0092B-C50C-407E-A947-70E740481C1C}">
                           <a14:useLocalDpi xmlns:a14="http://schemas.microsoft.com/office/drawing/2010/main" val="0"/>
@@ -2899,7 +3319,7 @@
           <w:szCs w:val="20"/>
         </w:rPr>
       </w:pPr>
-      <w:hyperlink r:id="rId12" w:history="1">
+      <w:hyperlink r:id="rId15" w:history="1">
         <w:r>
           <w:rPr>
             <w:rStyle w:val="Hyperlink"/>
@@ -2924,7 +3344,7 @@
           <w:szCs w:val="20"/>
         </w:rPr>
       </w:pPr>
-      <w:hyperlink r:id="rId13" w:history="1">
+      <w:hyperlink r:id="rId16" w:history="1">
         <w:r>
           <w:rPr>
             <w:rStyle w:val="Hyperlink"/>
@@ -2972,7 +3392,7 @@
           <w:szCs w:val="20"/>
         </w:rPr>
       </w:pPr>
-      <w:hyperlink r:id="rId14" w:history="1">
+      <w:hyperlink r:id="rId17" w:history="1">
         <w:r>
           <w:rPr>
             <w:rStyle w:val="Hyperlink"/>
@@ -3042,7 +3462,7 @@
           <w:szCs w:val="20"/>
         </w:rPr>
       </w:pPr>
-      <w:hyperlink r:id="rId15" w:history="1">
+      <w:hyperlink r:id="rId18" w:history="1">
         <w:r>
           <w:rPr>
             <w:rStyle w:val="Hyperlink"/>
@@ -3100,7 +3520,7 @@
           <w:szCs w:val="20"/>
         </w:rPr>
       </w:pPr>
-      <w:hyperlink r:id="rId16" w:history="1">
+      <w:hyperlink r:id="rId19" w:history="1">
         <w:r>
           <w:rPr>
             <w:rStyle w:val="Hyperlink"/>
@@ -3158,7 +3578,7 @@
           <w:szCs w:val="20"/>
         </w:rPr>
       </w:pPr>
-      <w:hyperlink r:id="rId17" w:history="1">
+      <w:hyperlink r:id="rId20" w:history="1">
         <w:proofErr w:type="spellStart"/>
         <w:r>
           <w:rPr>
@@ -3341,7 +3761,7 @@
         </w:rPr>
         <w:t xml:space="preserve">: Please reach out to </w:t>
       </w:r>
-      <w:hyperlink r:id="rId18" w:history="1">
+      <w:hyperlink r:id="rId21" w:history="1">
         <w:r>
           <w:rPr>
             <w:rStyle w:val="Hyperlink"/>
@@ -3759,12 +4179,12 @@
       </w:pPr>
     </w:p>
     <w:sectPr>
-      <w:headerReference w:type="even" r:id="rId23"/>
-      <w:headerReference w:type="default" r:id="rId24"/>
-      <w:footerReference w:type="even" r:id="rId25"/>
-      <w:footerReference w:type="default" r:id="rId26"/>
-      <w:headerReference w:type="first" r:id="rId27"/>
-      <w:footerReference w:type="first" r:id="rId28"/>
+      <w:headerReference w:type="even" r:id="rId26"/>
+      <w:headerReference w:type="default" r:id="rId27"/>
+      <w:footerReference w:type="even" r:id="rId28"/>
+      <w:footerReference w:type="default" r:id="rId29"/>
+      <w:headerReference w:type="first" r:id="rId30"/>
+      <w:footerReference w:type="first" r:id="rId31"/>
       <w:pgSz w:w="12240" w:h="15840"/>
       <w:pgMar w:top="1440" w:right="1440" w:bottom="1440" w:left="1440" w:header="720" w:footer="720" w:gutter="0"/>
       <w:pgNumType w:start="1"/>
@@ -5339,6 +5759,23 @@
     <w:basedOn w:val="DefaultParagraphFont"/>
     <w:rsid w:val="00FE13CA"/>
   </w:style>
+  <w:style w:type="paragraph" w:styleId="NormalWeb">
+    <w:name w:val="Normal (Web)"/>
+    <w:basedOn w:val="Normal"/>
+    <w:uiPriority w:val="99"/>
+    <w:semiHidden/>
+    <w:unhideWhenUsed/>
+    <w:rsid w:val="000527B9"/>
+    <w:pPr>
+      <w:spacing w:before="100" w:beforeAutospacing="1" w:after="100" w:afterAutospacing="1" w:line="240" w:lineRule="auto"/>
+    </w:pPr>
+    <w:rPr>
+      <w:rFonts w:ascii="Times New Roman" w:eastAsia="Times New Roman" w:hAnsi="Times New Roman" w:cs="Times New Roman"/>
+      <w:sz w:val="24"/>
+      <w:szCs w:val="24"/>
+      <w:lang w:val="en-US" w:eastAsia="en-US"/>
+    </w:rPr>
+  </w:style>
 </w:styles>
 </file>
 

</xml_diff>